<commit_message>
Bővített fejlesztői dokumentáció feltöltése
</commit_message>
<xml_diff>
--- a/Dokumentumok/Dokumentáció/fejlesztői_dokumentáció.docx
+++ b/Dokumentumok/Dokumentáció/fejlesztői_dokumentáció.docx
@@ -61,6 +61,7 @@
     <w:p>
       <w:pPr>
         <w:pStyle w:val="Listaszerbekezds"/>
+        <w:jc w:val="both"/>
         <w:rPr>
           <w:rFonts w:ascii="Arial" w:hAnsi="Arial" w:cs="Arial"/>
         </w:rPr>
@@ -89,14 +90,16 @@
     <w:p>
       <w:pPr>
         <w:pStyle w:val="Listaszerbekezds"/>
-        <w:rPr>
-          <w:rFonts w:ascii="Arial" w:hAnsi="Arial" w:cs="Arial"/>
-        </w:rPr>
-      </w:pPr>
-    </w:p>
-    <w:p>
-      <w:pPr>
-        <w:pStyle w:val="Listaszerbekezds"/>
+        <w:jc w:val="both"/>
+        <w:rPr>
+          <w:rFonts w:ascii="Arial" w:hAnsi="Arial" w:cs="Arial"/>
+        </w:rPr>
+      </w:pPr>
+    </w:p>
+    <w:p>
+      <w:pPr>
+        <w:pStyle w:val="Listaszerbekezds"/>
+        <w:jc w:val="both"/>
         <w:rPr>
           <w:rFonts w:ascii="Arial" w:hAnsi="Arial" w:cs="Arial"/>
         </w:rPr>
@@ -115,6 +118,7 @@
           <w:ilvl w:val="0"/>
           <w:numId w:val="2"/>
         </w:numPr>
+        <w:jc w:val="both"/>
         <w:rPr>
           <w:rFonts w:ascii="Arial" w:hAnsi="Arial" w:cs="Arial"/>
         </w:rPr>
@@ -133,6 +137,7 @@
           <w:ilvl w:val="0"/>
           <w:numId w:val="2"/>
         </w:numPr>
+        <w:jc w:val="both"/>
         <w:rPr>
           <w:rFonts w:ascii="Arial" w:hAnsi="Arial" w:cs="Arial"/>
         </w:rPr>
@@ -151,6 +156,7 @@
           <w:ilvl w:val="0"/>
           <w:numId w:val="2"/>
         </w:numPr>
+        <w:jc w:val="both"/>
         <w:rPr>
           <w:rFonts w:ascii="Arial" w:hAnsi="Arial" w:cs="Arial"/>
         </w:rPr>
@@ -169,6 +175,7 @@
           <w:ilvl w:val="0"/>
           <w:numId w:val="2"/>
         </w:numPr>
+        <w:jc w:val="both"/>
         <w:rPr>
           <w:rFonts w:ascii="Arial" w:hAnsi="Arial" w:cs="Arial"/>
         </w:rPr>
@@ -187,6 +194,7 @@
           <w:ilvl w:val="0"/>
           <w:numId w:val="2"/>
         </w:numPr>
+        <w:jc w:val="both"/>
         <w:rPr>
           <w:rFonts w:ascii="Arial" w:hAnsi="Arial" w:cs="Arial"/>
         </w:rPr>
@@ -205,6 +213,7 @@
           <w:ilvl w:val="0"/>
           <w:numId w:val="2"/>
         </w:numPr>
+        <w:jc w:val="both"/>
         <w:rPr>
           <w:rFonts w:ascii="Arial" w:hAnsi="Arial" w:cs="Arial"/>
         </w:rPr>
@@ -223,6 +232,7 @@
           <w:ilvl w:val="0"/>
           <w:numId w:val="2"/>
         </w:numPr>
+        <w:jc w:val="both"/>
         <w:rPr>
           <w:rFonts w:ascii="Arial" w:hAnsi="Arial" w:cs="Arial"/>
         </w:rPr>
@@ -241,6 +251,7 @@
           <w:ilvl w:val="0"/>
           <w:numId w:val="2"/>
         </w:numPr>
+        <w:jc w:val="both"/>
         <w:rPr>
           <w:rFonts w:ascii="Arial" w:hAnsi="Arial" w:cs="Arial"/>
         </w:rPr>
@@ -259,6 +270,7 @@
           <w:ilvl w:val="0"/>
           <w:numId w:val="2"/>
         </w:numPr>
+        <w:jc w:val="both"/>
         <w:rPr>
           <w:rFonts w:ascii="Arial" w:hAnsi="Arial" w:cs="Arial"/>
         </w:rPr>
@@ -277,6 +289,7 @@
           <w:ilvl w:val="0"/>
           <w:numId w:val="2"/>
         </w:numPr>
+        <w:jc w:val="both"/>
         <w:rPr>
           <w:rFonts w:ascii="Arial" w:hAnsi="Arial" w:cs="Arial"/>
         </w:rPr>
@@ -291,6 +304,7 @@
     <w:p>
       <w:pPr>
         <w:ind w:left="708"/>
+        <w:jc w:val="both"/>
         <w:rPr>
           <w:rFonts w:ascii="Arial" w:hAnsi="Arial" w:cs="Arial"/>
         </w:rPr>
@@ -335,49 +349,7 @@
         <w:rPr>
           <w:rFonts w:ascii="Arial" w:hAnsi="Arial" w:cs="Arial"/>
         </w:rPr>
-        <w:t xml:space="preserve"> része </w:t>
-      </w:r>
-      <w:proofErr w:type="spellStart"/>
-      <w:r>
-        <w:rPr>
-          <w:rFonts w:ascii="Arial" w:hAnsi="Arial" w:cs="Arial"/>
-        </w:rPr>
-        <w:t>Angular</w:t>
-      </w:r>
-      <w:proofErr w:type="spellEnd"/>
-      <w:r>
-        <w:rPr>
-          <w:rFonts w:ascii="Arial" w:hAnsi="Arial" w:cs="Arial"/>
-        </w:rPr>
-        <w:t xml:space="preserve"> 17-ben és </w:t>
-      </w:r>
-      <w:proofErr w:type="spellStart"/>
-      <w:r>
-        <w:rPr>
-          <w:rFonts w:ascii="Arial" w:hAnsi="Arial" w:cs="Arial"/>
-        </w:rPr>
-        <w:t>Angular</w:t>
-      </w:r>
-      <w:proofErr w:type="spellEnd"/>
-      <w:r>
-        <w:rPr>
-          <w:rFonts w:ascii="Arial" w:hAnsi="Arial" w:cs="Arial"/>
-        </w:rPr>
-        <w:t xml:space="preserve"> </w:t>
-      </w:r>
-      <w:proofErr w:type="spellStart"/>
-      <w:r>
-        <w:rPr>
-          <w:rFonts w:ascii="Arial" w:hAnsi="Arial" w:cs="Arial"/>
-        </w:rPr>
-        <w:t>Material</w:t>
-      </w:r>
-      <w:proofErr w:type="spellEnd"/>
-      <w:r>
-        <w:rPr>
-          <w:rFonts w:ascii="Arial" w:hAnsi="Arial" w:cs="Arial"/>
-        </w:rPr>
-        <w:t xml:space="preserve">, a </w:t>
+        <w:t xml:space="preserve"> része Angular 17-ben és Angular Material, a </w:t>
       </w:r>
       <w:r>
         <w:rPr>
@@ -423,6 +395,7 @@
           <w:ilvl w:val="0"/>
           <w:numId w:val="2"/>
         </w:numPr>
+        <w:jc w:val="both"/>
         <w:rPr>
           <w:rFonts w:ascii="Arial" w:hAnsi="Arial" w:cs="Arial"/>
         </w:rPr>
@@ -433,42 +406,21 @@
         </w:rPr>
         <w:t xml:space="preserve">Klónozza a </w:t>
       </w:r>
-      <w:proofErr w:type="spellStart"/>
-      <w:r>
-        <w:rPr>
-          <w:rFonts w:ascii="Arial" w:hAnsi="Arial" w:cs="Arial"/>
-        </w:rPr>
-        <w:t>github</w:t>
-      </w:r>
-      <w:proofErr w:type="spellEnd"/>
-      <w:r>
-        <w:rPr>
-          <w:rFonts w:ascii="Arial" w:hAnsi="Arial" w:cs="Arial"/>
-        </w:rPr>
-        <w:t xml:space="preserve"> </w:t>
-      </w:r>
-      <w:proofErr w:type="spellStart"/>
-      <w:r>
-        <w:rPr>
-          <w:rFonts w:ascii="Arial" w:hAnsi="Arial" w:cs="Arial"/>
-        </w:rPr>
-        <w:t>repositoryt</w:t>
-      </w:r>
-      <w:proofErr w:type="spellEnd"/>
-      <w:r>
-        <w:rPr>
-          <w:rFonts w:ascii="Arial" w:hAnsi="Arial" w:cs="Arial"/>
-        </w:rPr>
-        <w:t>.</w:t>
-      </w:r>
-    </w:p>
-    <w:p>
-      <w:pPr>
-        <w:pStyle w:val="Listaszerbekezds"/>
-        <w:numPr>
-          <w:ilvl w:val="0"/>
-          <w:numId w:val="2"/>
-        </w:numPr>
+      <w:r>
+        <w:rPr>
+          <w:rFonts w:ascii="Arial" w:hAnsi="Arial" w:cs="Arial"/>
+        </w:rPr>
+        <w:t>github repositoryt.</w:t>
+      </w:r>
+    </w:p>
+    <w:p>
+      <w:pPr>
+        <w:pStyle w:val="Listaszerbekezds"/>
+        <w:numPr>
+          <w:ilvl w:val="0"/>
+          <w:numId w:val="2"/>
+        </w:numPr>
+        <w:jc w:val="both"/>
         <w:rPr>
           <w:rFonts w:ascii="Arial" w:hAnsi="Arial" w:cs="Arial"/>
         </w:rPr>
@@ -479,7 +431,6 @@
         </w:rPr>
         <w:t xml:space="preserve">Indítsa el az adatbázis kezelő alkalmazást (ajánlott az </w:t>
       </w:r>
-      <w:proofErr w:type="spellStart"/>
       <w:r>
         <w:rPr>
           <w:rFonts w:ascii="Arial" w:hAnsi="Arial" w:cs="Arial"/>
@@ -492,23 +443,17 @@
         <w:rPr>
           <w:rFonts w:ascii="Arial" w:hAnsi="Arial" w:cs="Arial"/>
         </w:rPr>
-        <w:t>ot</w:t>
-      </w:r>
-      <w:proofErr w:type="spellEnd"/>
-      <w:r>
-        <w:rPr>
-          <w:rFonts w:ascii="Arial" w:hAnsi="Arial" w:cs="Arial"/>
-        </w:rPr>
-        <w:t xml:space="preserve"> használni).</w:t>
-      </w:r>
-    </w:p>
-    <w:p>
-      <w:pPr>
-        <w:pStyle w:val="Listaszerbekezds"/>
-        <w:numPr>
-          <w:ilvl w:val="0"/>
-          <w:numId w:val="2"/>
-        </w:numPr>
+        <w:t>ot használni).</w:t>
+      </w:r>
+    </w:p>
+    <w:p>
+      <w:pPr>
+        <w:pStyle w:val="Listaszerbekezds"/>
+        <w:numPr>
+          <w:ilvl w:val="0"/>
+          <w:numId w:val="2"/>
+        </w:numPr>
+        <w:jc w:val="both"/>
         <w:rPr>
           <w:rFonts w:ascii="Arial" w:hAnsi="Arial" w:cs="Arial"/>
         </w:rPr>
@@ -541,6 +486,7 @@
           <w:ilvl w:val="0"/>
           <w:numId w:val="2"/>
         </w:numPr>
+        <w:jc w:val="both"/>
         <w:rPr>
           <w:rFonts w:ascii="Arial" w:hAnsi="Arial" w:cs="Arial"/>
         </w:rPr>
@@ -557,36 +503,8 @@
           <w:b/>
           <w:bCs/>
         </w:rPr>
-        <w:t xml:space="preserve">Visual </w:t>
-      </w:r>
-      <w:proofErr w:type="spellStart"/>
-      <w:r>
-        <w:rPr>
-          <w:rFonts w:ascii="Arial" w:hAnsi="Arial" w:cs="Arial"/>
-          <w:b/>
-          <w:bCs/>
-        </w:rPr>
-        <w:t>Studio</w:t>
-      </w:r>
-      <w:proofErr w:type="spellEnd"/>
-      <w:r>
-        <w:rPr>
-          <w:rFonts w:ascii="Arial" w:hAnsi="Arial" w:cs="Arial"/>
-          <w:b/>
-          <w:bCs/>
-        </w:rPr>
-        <w:t xml:space="preserve"> </w:t>
-      </w:r>
-      <w:proofErr w:type="spellStart"/>
-      <w:r>
-        <w:rPr>
-          <w:rFonts w:ascii="Arial" w:hAnsi="Arial" w:cs="Arial"/>
-          <w:b/>
-          <w:bCs/>
-        </w:rPr>
-        <w:t>Code</w:t>
-      </w:r>
-      <w:proofErr w:type="spellEnd"/>
+        <w:t>Visual Studio Code</w:t>
+      </w:r>
       <w:r>
         <w:rPr>
           <w:rFonts w:ascii="Arial" w:hAnsi="Arial" w:cs="Arial"/>
@@ -601,98 +519,45 @@
           <w:ilvl w:val="0"/>
           <w:numId w:val="2"/>
         </w:numPr>
-        <w:rPr>
-          <w:rFonts w:ascii="Arial" w:hAnsi="Arial" w:cs="Arial"/>
-        </w:rPr>
-      </w:pPr>
-      <w:r>
-        <w:rPr>
-          <w:rFonts w:ascii="Arial" w:hAnsi="Arial" w:cs="Arial"/>
-        </w:rPr>
-        <w:t>Ezt követően nyisson egy új terminált és írja be a következőt: „</w:t>
-      </w:r>
-      <w:proofErr w:type="gramStart"/>
-      <w:r>
-        <w:rPr>
-          <w:rFonts w:ascii="Arial" w:hAnsi="Arial" w:cs="Arial"/>
-        </w:rPr>
-        <w:t>cd .</w:t>
-      </w:r>
-      <w:proofErr w:type="gramEnd"/>
-      <w:r>
-        <w:rPr>
-          <w:rFonts w:ascii="Arial" w:hAnsi="Arial" w:cs="Arial"/>
-        </w:rPr>
-        <w:t>\API\”.</w:t>
-      </w:r>
-    </w:p>
-    <w:p>
-      <w:pPr>
-        <w:pStyle w:val="Listaszerbekezds"/>
-        <w:numPr>
-          <w:ilvl w:val="0"/>
-          <w:numId w:val="2"/>
-        </w:numPr>
-        <w:rPr>
-          <w:rFonts w:ascii="Arial" w:hAnsi="Arial" w:cs="Arial"/>
-        </w:rPr>
-      </w:pPr>
-      <w:r>
-        <w:rPr>
-          <w:rFonts w:ascii="Arial" w:hAnsi="Arial" w:cs="Arial"/>
-        </w:rPr>
-        <w:t>Nyomjon egy entert és ezután írja be a következőt: „</w:t>
-      </w:r>
-      <w:proofErr w:type="spellStart"/>
-      <w:r>
-        <w:rPr>
-          <w:rFonts w:ascii="Arial" w:hAnsi="Arial" w:cs="Arial"/>
-        </w:rPr>
-        <w:t>npm</w:t>
-      </w:r>
-      <w:proofErr w:type="spellEnd"/>
-      <w:r>
-        <w:rPr>
-          <w:rFonts w:ascii="Arial" w:hAnsi="Arial" w:cs="Arial"/>
-        </w:rPr>
-        <w:t xml:space="preserve"> </w:t>
-      </w:r>
-      <w:proofErr w:type="spellStart"/>
-      <w:r>
-        <w:rPr>
-          <w:rFonts w:ascii="Arial" w:hAnsi="Arial" w:cs="Arial"/>
-        </w:rPr>
-        <w:t>run</w:t>
-      </w:r>
-      <w:proofErr w:type="spellEnd"/>
-      <w:r>
-        <w:rPr>
-          <w:rFonts w:ascii="Arial" w:hAnsi="Arial" w:cs="Arial"/>
-        </w:rPr>
-        <w:t xml:space="preserve"> </w:t>
-      </w:r>
-      <w:proofErr w:type="spellStart"/>
-      <w:r>
-        <w:rPr>
-          <w:rFonts w:ascii="Arial" w:hAnsi="Arial" w:cs="Arial"/>
-        </w:rPr>
-        <w:t>dev</w:t>
-      </w:r>
-      <w:proofErr w:type="spellEnd"/>
-      <w:r>
-        <w:rPr>
-          <w:rFonts w:ascii="Arial" w:hAnsi="Arial" w:cs="Arial"/>
-        </w:rPr>
-        <w:t>”.</w:t>
-      </w:r>
-    </w:p>
-    <w:p>
-      <w:pPr>
-        <w:pStyle w:val="Listaszerbekezds"/>
-        <w:numPr>
-          <w:ilvl w:val="0"/>
-          <w:numId w:val="2"/>
-        </w:numPr>
+        <w:jc w:val="both"/>
+        <w:rPr>
+          <w:rFonts w:ascii="Arial" w:hAnsi="Arial" w:cs="Arial"/>
+        </w:rPr>
+      </w:pPr>
+      <w:r>
+        <w:rPr>
+          <w:rFonts w:ascii="Arial" w:hAnsi="Arial" w:cs="Arial"/>
+        </w:rPr>
+        <w:t>Ezt követően nyisson egy új terminált és írja be a következőt: „cd .\API\”.</w:t>
+      </w:r>
+    </w:p>
+    <w:p>
+      <w:pPr>
+        <w:pStyle w:val="Listaszerbekezds"/>
+        <w:numPr>
+          <w:ilvl w:val="0"/>
+          <w:numId w:val="2"/>
+        </w:numPr>
+        <w:jc w:val="both"/>
+        <w:rPr>
+          <w:rFonts w:ascii="Arial" w:hAnsi="Arial" w:cs="Arial"/>
+        </w:rPr>
+      </w:pPr>
+      <w:r>
+        <w:rPr>
+          <w:rFonts w:ascii="Arial" w:hAnsi="Arial" w:cs="Arial"/>
+        </w:rPr>
+        <w:t>Nyomjon egy entert és ezután írja be a következőt: „npm run dev”.</w:t>
+      </w:r>
+    </w:p>
+    <w:p>
+      <w:pPr>
+        <w:pStyle w:val="Listaszerbekezds"/>
+        <w:numPr>
+          <w:ilvl w:val="0"/>
+          <w:numId w:val="2"/>
+        </w:numPr>
+        <w:jc w:val="both"/>
         <w:rPr>
           <w:rFonts w:ascii="Arial" w:hAnsi="Arial" w:cs="Arial"/>
         </w:rPr>
@@ -711,6 +576,7 @@
           <w:ilvl w:val="0"/>
           <w:numId w:val="2"/>
         </w:numPr>
+        <w:jc w:val="both"/>
         <w:rPr>
           <w:rFonts w:ascii="Arial" w:hAnsi="Arial" w:cs="Arial"/>
         </w:rPr>
@@ -729,6 +595,7 @@
           <w:ilvl w:val="0"/>
           <w:numId w:val="2"/>
         </w:numPr>
+        <w:jc w:val="both"/>
         <w:rPr>
           <w:rFonts w:ascii="Arial" w:hAnsi="Arial" w:cs="Arial"/>
         </w:rPr>
@@ -751,19 +618,11 @@
         </w:rPr>
         <w:t xml:space="preserve"> be, hogy „</w:t>
       </w:r>
-      <w:proofErr w:type="gramStart"/>
-      <w:r>
-        <w:rPr>
-          <w:rFonts w:ascii="Arial" w:hAnsi="Arial" w:cs="Arial"/>
-        </w:rPr>
-        <w:t>cd .</w:t>
-      </w:r>
-      <w:proofErr w:type="gramEnd"/>
-      <w:r>
-        <w:rPr>
-          <w:rFonts w:ascii="Arial" w:hAnsi="Arial" w:cs="Arial"/>
-        </w:rPr>
-        <w:t>\Public\”</w:t>
+      <w:r>
+        <w:rPr>
+          <w:rFonts w:ascii="Arial" w:hAnsi="Arial" w:cs="Arial"/>
+        </w:rPr>
+        <w:t>cd .\Public\”</w:t>
       </w:r>
       <w:r>
         <w:rPr>
@@ -779,47 +638,65 @@
           <w:ilvl w:val="0"/>
           <w:numId w:val="2"/>
         </w:numPr>
-        <w:rPr>
-          <w:rFonts w:ascii="Arial" w:hAnsi="Arial" w:cs="Arial"/>
-        </w:rPr>
-      </w:pPr>
-      <w:r>
-        <w:rPr>
-          <w:rFonts w:ascii="Arial" w:hAnsi="Arial" w:cs="Arial"/>
-        </w:rPr>
-        <w:t>Utolsó lépésben pedig írja be „</w:t>
-      </w:r>
-      <w:proofErr w:type="spellStart"/>
-      <w:r>
-        <w:rPr>
-          <w:rFonts w:ascii="Arial" w:hAnsi="Arial" w:cs="Arial"/>
-        </w:rPr>
-        <w:t>npm</w:t>
-      </w:r>
-      <w:proofErr w:type="spellEnd"/>
-      <w:r>
-        <w:rPr>
-          <w:rFonts w:ascii="Arial" w:hAnsi="Arial" w:cs="Arial"/>
-        </w:rPr>
-        <w:t xml:space="preserve"> start”</w:t>
-      </w:r>
-    </w:p>
-    <w:p>
-      <w:pPr>
-        <w:pStyle w:val="Listaszerbekezds"/>
-        <w:numPr>
-          <w:ilvl w:val="0"/>
-          <w:numId w:val="2"/>
-        </w:numPr>
-        <w:rPr>
-          <w:rFonts w:ascii="Arial" w:hAnsi="Arial" w:cs="Arial"/>
-        </w:rPr>
-      </w:pPr>
-      <w:r>
-        <w:rPr>
-          <w:rFonts w:ascii="Arial" w:hAnsi="Arial" w:cs="Arial"/>
-        </w:rPr>
-        <w:t xml:space="preserve">A böngésző fejlécébe pedig írja be, hogy </w:t>
+        <w:jc w:val="both"/>
+        <w:rPr>
+          <w:rFonts w:ascii="Arial" w:hAnsi="Arial" w:cs="Arial"/>
+        </w:rPr>
+      </w:pPr>
+      <w:r>
+        <w:rPr>
+          <w:rFonts w:ascii="Arial" w:hAnsi="Arial" w:cs="Arial"/>
+        </w:rPr>
+        <w:t>Utolsó lépésben pedig írja be „npm start”</w:t>
+      </w:r>
+      <w:r>
+        <w:rPr>
+          <w:rFonts w:ascii="Arial" w:hAnsi="Arial" w:cs="Arial"/>
+        </w:rPr>
+        <w:t xml:space="preserve"> és ismét nyomjon entert.</w:t>
+      </w:r>
+    </w:p>
+    <w:p>
+      <w:pPr>
+        <w:pStyle w:val="Listaszerbekezds"/>
+        <w:numPr>
+          <w:ilvl w:val="0"/>
+          <w:numId w:val="2"/>
+        </w:numPr>
+        <w:jc w:val="both"/>
+        <w:rPr>
+          <w:rFonts w:ascii="Arial" w:hAnsi="Arial" w:cs="Arial"/>
+        </w:rPr>
+      </w:pPr>
+      <w:r>
+        <w:rPr>
+          <w:rFonts w:ascii="Arial" w:hAnsi="Arial" w:cs="Arial"/>
+        </w:rPr>
+        <w:t>A böngésző</w:t>
+      </w:r>
+      <w:r>
+        <w:rPr>
+          <w:rFonts w:ascii="Arial" w:hAnsi="Arial" w:cs="Arial"/>
+        </w:rPr>
+        <w:t xml:space="preserve"> megnyitása után pedig a</w:t>
+      </w:r>
+      <w:r>
+        <w:rPr>
+          <w:rFonts w:ascii="Arial" w:hAnsi="Arial" w:cs="Arial"/>
+        </w:rPr>
+        <w:t xml:space="preserve"> fejléc</w:t>
+      </w:r>
+      <w:r>
+        <w:rPr>
+          <w:rFonts w:ascii="Arial" w:hAnsi="Arial" w:cs="Arial"/>
+        </w:rPr>
+        <w:t xml:space="preserve">be </w:t>
+      </w:r>
+      <w:r>
+        <w:rPr>
+          <w:rFonts w:ascii="Arial" w:hAnsi="Arial" w:cs="Arial"/>
+        </w:rPr>
+        <w:t xml:space="preserve">írja be, hogy </w:t>
       </w:r>
       <w:hyperlink r:id="rId5" w:history="1">
         <w:r>
@@ -889,6 +766,7 @@
           <w:rFonts w:ascii="Arial" w:hAnsi="Arial" w:cs="Arial"/>
           <w:b/>
           <w:bCs/>
+          <w:noProof/>
         </w:rPr>
         <w:drawing>
           <wp:inline distT="0" distB="0" distL="0" distR="0" wp14:anchorId="3D929FE8" wp14:editId="6C314C1B">
@@ -993,13 +871,520 @@
     </w:p>
     <w:p>
       <w:pPr>
+        <w:pStyle w:val="Listaszerbekezds"/>
+        <w:rPr>
+          <w:rFonts w:ascii="Arial" w:hAnsi="Arial" w:cs="Arial"/>
+          <w:b/>
+          <w:bCs/>
+        </w:rPr>
+      </w:pPr>
+    </w:p>
+    <w:p>
+      <w:pPr>
+        <w:pStyle w:val="Listaszerbekezds"/>
+        <w:numPr>
+          <w:ilvl w:val="0"/>
+          <w:numId w:val="1"/>
+        </w:numPr>
+        <w:rPr>
+          <w:rFonts w:ascii="Arial" w:hAnsi="Arial" w:cs="Arial"/>
+          <w:b/>
+          <w:bCs/>
+        </w:rPr>
+      </w:pPr>
+      <w:r>
+        <w:rPr>
+          <w:rFonts w:ascii="Arial" w:hAnsi="Arial" w:cs="Arial"/>
+          <w:b/>
+          <w:bCs/>
+        </w:rPr>
+        <w:t>Használati útmutató:</w:t>
+      </w:r>
+    </w:p>
+    <w:p>
+      <w:pPr>
+        <w:pStyle w:val="Listaszerbekezds"/>
+        <w:rPr>
+          <w:rFonts w:ascii="Arial" w:hAnsi="Arial" w:cs="Arial"/>
+          <w:b/>
+          <w:bCs/>
+        </w:rPr>
+      </w:pPr>
+    </w:p>
+    <w:p>
+      <w:pPr>
+        <w:pStyle w:val="Listaszerbekezds"/>
+        <w:numPr>
+          <w:ilvl w:val="0"/>
+          <w:numId w:val="1"/>
+        </w:numPr>
+        <w:rPr>
+          <w:rFonts w:ascii="Arial" w:hAnsi="Arial" w:cs="Arial"/>
+          <w:b/>
+          <w:bCs/>
+        </w:rPr>
+      </w:pPr>
+      <w:r>
+        <w:rPr>
+          <w:rFonts w:ascii="Arial" w:hAnsi="Arial" w:cs="Arial"/>
+          <w:b/>
+          <w:bCs/>
+        </w:rPr>
+        <w:t>Jogosultságok / szerepkörök:</w:t>
+      </w:r>
+    </w:p>
+    <w:p>
+      <w:pPr>
+        <w:pStyle w:val="Listaszerbekezds"/>
+        <w:rPr>
+          <w:rFonts w:ascii="Arial" w:hAnsi="Arial" w:cs="Arial"/>
+          <w:b/>
+          <w:bCs/>
+        </w:rPr>
+      </w:pPr>
+    </w:p>
+    <w:p>
+      <w:pPr>
+        <w:pStyle w:val="Listaszerbekezds"/>
+        <w:rPr>
+          <w:rFonts w:ascii="Arial" w:hAnsi="Arial" w:cs="Arial"/>
+        </w:rPr>
+      </w:pPr>
+      <w:r>
+        <w:rPr>
+          <w:rFonts w:ascii="Arial" w:hAnsi="Arial" w:cs="Arial"/>
+        </w:rPr>
+        <w:t xml:space="preserve">Az oldal két darab szerepkörrel látogatható. Az egyik a mindenki számára elérhető </w:t>
+      </w:r>
+      <w:r>
+        <w:rPr>
+          <w:rFonts w:ascii="Arial" w:hAnsi="Arial" w:cs="Arial"/>
+          <w:b/>
+          <w:bCs/>
+        </w:rPr>
+        <w:t>Felhasználó</w:t>
+      </w:r>
+      <w:r>
+        <w:rPr>
+          <w:rFonts w:ascii="Arial" w:hAnsi="Arial" w:cs="Arial"/>
+          <w:b/>
+          <w:bCs/>
+        </w:rPr>
+        <w:t xml:space="preserve"> </w:t>
+      </w:r>
+      <w:r>
+        <w:rPr>
+          <w:rFonts w:ascii="Arial" w:hAnsi="Arial" w:cs="Arial"/>
+        </w:rPr>
+        <w:t xml:space="preserve">a másik pedig a fejlesztők által kijelölt moderátor az </w:t>
+      </w:r>
+      <w:r>
+        <w:rPr>
+          <w:rFonts w:ascii="Arial" w:hAnsi="Arial" w:cs="Arial"/>
+          <w:b/>
+          <w:bCs/>
+        </w:rPr>
+        <w:t>Admin</w:t>
+      </w:r>
+      <w:r>
+        <w:rPr>
+          <w:rFonts w:ascii="Arial" w:hAnsi="Arial" w:cs="Arial"/>
+          <w:b/>
+          <w:bCs/>
+        </w:rPr>
+        <w:t xml:space="preserve">. </w:t>
+      </w:r>
+      <w:r>
+        <w:rPr>
+          <w:rFonts w:ascii="Arial" w:hAnsi="Arial" w:cs="Arial"/>
+        </w:rPr>
+        <w:t xml:space="preserve">Regisztráláskor minden fiók felhasználóként jön létre. Később az adatbázisban tudja módosítani az adatbázishoz hozzáféréssel rendelkező fejlesztő. </w:t>
+      </w:r>
+    </w:p>
+    <w:p>
+      <w:pPr>
+        <w:pStyle w:val="Listaszerbekezds"/>
+        <w:numPr>
+          <w:ilvl w:val="0"/>
+          <w:numId w:val="2"/>
+        </w:numPr>
+        <w:rPr>
+          <w:rFonts w:ascii="Arial" w:hAnsi="Arial" w:cs="Arial"/>
+        </w:rPr>
+      </w:pPr>
+      <w:r>
+        <w:rPr>
+          <w:rFonts w:ascii="Arial" w:hAnsi="Arial" w:cs="Arial"/>
+        </w:rPr>
+        <w:t>Felhasználóként jogosult a személy események között böngészni, azokra feliratkozni, valamint létrehozni is. Ezek mellett meg tudja változtatni a jelszavát, a felhasználónevét, az e-mail címét és a profilképét is.</w:t>
+      </w:r>
+    </w:p>
+    <w:p>
+      <w:pPr>
+        <w:pStyle w:val="Listaszerbekezds"/>
+        <w:numPr>
+          <w:ilvl w:val="0"/>
+          <w:numId w:val="2"/>
+        </w:numPr>
+        <w:rPr>
+          <w:rFonts w:ascii="Arial" w:hAnsi="Arial" w:cs="Arial"/>
+        </w:rPr>
+      </w:pPr>
+      <w:r>
+        <w:rPr>
+          <w:rFonts w:ascii="Arial" w:hAnsi="Arial" w:cs="Arial"/>
+        </w:rPr>
+        <w:t>Az admin szerepkörrel ellátott fiókok jogosultak törölni eseményeket és fiókokat.</w:t>
+      </w:r>
+    </w:p>
+    <w:p>
+      <w:pPr>
+        <w:pStyle w:val="Listaszerbekezds"/>
+        <w:rPr>
+          <w:rFonts w:ascii="Arial" w:hAnsi="Arial" w:cs="Arial"/>
+          <w:b/>
+          <w:bCs/>
+        </w:rPr>
+      </w:pPr>
+    </w:p>
+    <w:p>
+      <w:pPr>
+        <w:pStyle w:val="Listaszerbekezds"/>
+        <w:numPr>
+          <w:ilvl w:val="0"/>
+          <w:numId w:val="1"/>
+        </w:numPr>
+        <w:rPr>
+          <w:rFonts w:ascii="Arial" w:hAnsi="Arial" w:cs="Arial"/>
+          <w:b/>
+          <w:bCs/>
+        </w:rPr>
+      </w:pPr>
+      <w:r>
+        <w:rPr>
+          <w:rFonts w:ascii="Arial" w:hAnsi="Arial" w:cs="Arial"/>
+          <w:b/>
+          <w:bCs/>
+        </w:rPr>
+        <w:t>Ismert hibák, jövőbeli tervek:</w:t>
+      </w:r>
+    </w:p>
+    <w:p>
+      <w:pPr>
+        <w:pStyle w:val="Listaszerbekezds"/>
+        <w:rPr>
+          <w:rFonts w:ascii="Arial" w:hAnsi="Arial" w:cs="Arial"/>
+          <w:b/>
+          <w:bCs/>
+        </w:rPr>
+      </w:pPr>
+    </w:p>
+    <w:p>
+      <w:pPr>
+        <w:pStyle w:val="Listaszerbekezds"/>
+        <w:jc w:val="both"/>
+        <w:rPr>
+          <w:rFonts w:ascii="Arial" w:hAnsi="Arial" w:cs="Arial"/>
+        </w:rPr>
+      </w:pPr>
+      <w:r>
+        <w:rPr>
+          <w:rFonts w:ascii="Arial" w:hAnsi="Arial" w:cs="Arial"/>
+          <w:bCs/>
+        </w:rPr>
+        <w:lastRenderedPageBreak/>
+        <w:t>A tesztelés alatt fellelt hibát lekezeltük és hibaüzenetekkel láttuk el őket, hogy a felhasználónak mindig egyértelmű legyen, hogy pontosan mi is a probléma és mit kell máshogyan csinálnia.</w:t>
+      </w:r>
+    </w:p>
+    <w:p>
+      <w:pPr>
+        <w:pStyle w:val="Listaszerbekezds"/>
+        <w:jc w:val="both"/>
+        <w:rPr>
+          <w:rFonts w:ascii="Arial" w:hAnsi="Arial" w:cs="Arial"/>
+        </w:rPr>
+      </w:pPr>
+      <w:r>
+        <w:rPr>
+          <w:rFonts w:ascii="Arial" w:hAnsi="Arial" w:cs="Arial"/>
+        </w:rPr>
+        <w:t>Számos ötletünk van, amivel szeretnénk a jövőben kibővíteni a projektet. Ilyen például a cégként való regisztrálás és a szerepkörhöz tartozó funkciók megvalósítása (szabad időpontok meghirdetése rendezvényekhez, hivatalos események közzététele). Mindenkit érintő fejlesztés lenne, hogy nem csak eseményeket, hanem felhasználókat (magánszemélyeket és cégeket) is lehessen értékelni.</w:t>
+      </w:r>
+    </w:p>
+    <w:p>
+      <w:pPr>
+        <w:pStyle w:val="Listaszerbekezds"/>
+        <w:rPr>
+          <w:rFonts w:ascii="Arial" w:hAnsi="Arial" w:cs="Arial"/>
+          <w:b/>
+          <w:bCs/>
+        </w:rPr>
+      </w:pPr>
+    </w:p>
+    <w:p>
+      <w:pPr>
+        <w:pStyle w:val="Listaszerbekezds"/>
+        <w:numPr>
+          <w:ilvl w:val="0"/>
+          <w:numId w:val="1"/>
+        </w:numPr>
+        <w:rPr>
+          <w:rFonts w:ascii="Arial" w:hAnsi="Arial" w:cs="Arial"/>
+          <w:b/>
+          <w:bCs/>
+        </w:rPr>
+      </w:pPr>
+      <w:r>
+        <w:rPr>
+          <w:rFonts w:ascii="Arial" w:hAnsi="Arial" w:cs="Arial"/>
+          <w:b/>
+          <w:bCs/>
+        </w:rPr>
+        <w:t>Fejlesztők, készítők:</w:t>
+      </w:r>
+    </w:p>
+    <w:p>
+      <w:pPr>
         <w:ind w:left="708"/>
         <w:rPr>
           <w:rFonts w:ascii="Arial" w:hAnsi="Arial" w:cs="Arial"/>
-          <w:b/>
-          <w:bCs/>
-        </w:rPr>
-      </w:pPr>
+        </w:rPr>
+      </w:pPr>
+      <w:r>
+        <w:rPr>
+          <w:rFonts w:ascii="Arial" w:hAnsi="Arial" w:cs="Arial"/>
+        </w:rPr>
+        <w:t>A fejlesztők:</w:t>
+      </w:r>
+    </w:p>
+    <w:p>
+      <w:pPr>
+        <w:pStyle w:val="Listaszerbekezds"/>
+        <w:numPr>
+          <w:ilvl w:val="0"/>
+          <w:numId w:val="2"/>
+        </w:numPr>
+        <w:jc w:val="both"/>
+        <w:rPr>
+          <w:rFonts w:ascii="Arial" w:hAnsi="Arial" w:cs="Arial"/>
+        </w:rPr>
+      </w:pPr>
+      <w:r>
+        <w:rPr>
+          <w:rFonts w:ascii="Arial" w:hAnsi="Arial" w:cs="Arial"/>
+        </w:rPr>
+        <w:t>Csanádi Kevin: Frontend fejlesztő, design tervező (csanadikevin@turr.hu)</w:t>
+      </w:r>
+    </w:p>
+    <w:p>
+      <w:pPr>
+        <w:pStyle w:val="Listaszerbekezds"/>
+        <w:numPr>
+          <w:ilvl w:val="0"/>
+          <w:numId w:val="2"/>
+        </w:numPr>
+        <w:jc w:val="both"/>
+        <w:rPr>
+          <w:rFonts w:ascii="Arial" w:hAnsi="Arial" w:cs="Arial"/>
+        </w:rPr>
+      </w:pPr>
+      <w:r>
+        <w:rPr>
+          <w:rFonts w:ascii="Arial" w:hAnsi="Arial" w:cs="Arial"/>
+        </w:rPr>
+        <w:t>Kulimák Máté: Frontend fejlesztő, jira és github kezelő (kulimakmate@turr.hu)</w:t>
+      </w:r>
+    </w:p>
+    <w:p>
+      <w:pPr>
+        <w:pStyle w:val="Listaszerbekezds"/>
+        <w:numPr>
+          <w:ilvl w:val="0"/>
+          <w:numId w:val="2"/>
+        </w:numPr>
+        <w:jc w:val="both"/>
+        <w:rPr>
+          <w:rFonts w:ascii="Arial" w:hAnsi="Arial" w:cs="Arial"/>
+        </w:rPr>
+      </w:pPr>
+      <w:r>
+        <w:rPr>
+          <w:rFonts w:ascii="Arial" w:hAnsi="Arial" w:cs="Arial"/>
+        </w:rPr>
+        <w:t>Mojzes Ervin: Backend fejlesztő, tesztelő (mojzeservin@turr.hu)</w:t>
+      </w:r>
+    </w:p>
+    <w:p>
+      <w:pPr>
+        <w:pStyle w:val="Listaszerbekezds"/>
+        <w:ind w:left="1080"/>
+        <w:jc w:val="both"/>
+        <w:rPr>
+          <w:rFonts w:ascii="Arial" w:hAnsi="Arial" w:cs="Arial"/>
+        </w:rPr>
+      </w:pPr>
+    </w:p>
+    <w:p>
+      <w:pPr>
+        <w:ind w:left="708"/>
+        <w:jc w:val="both"/>
+        <w:rPr>
+          <w:rFonts w:ascii="Arial" w:hAnsi="Arial" w:cs="Arial"/>
+        </w:rPr>
+      </w:pPr>
+      <w:r>
+        <w:rPr>
+          <w:rFonts w:ascii="Arial" w:hAnsi="Arial" w:cs="Arial"/>
+        </w:rPr>
+        <w:t>Egészen az ötlet kitalálásától kezdve mi hárman valósítottunk meg mindent.</w:t>
+      </w:r>
+    </w:p>
+    <w:p>
+      <w:pPr>
+        <w:pStyle w:val="Listaszerbekezds"/>
+        <w:numPr>
+          <w:ilvl w:val="0"/>
+          <w:numId w:val="1"/>
+        </w:numPr>
+        <w:rPr>
+          <w:rFonts w:ascii="Arial" w:hAnsi="Arial" w:cs="Arial"/>
+          <w:b/>
+          <w:bCs/>
+        </w:rPr>
+      </w:pPr>
+      <w:r>
+        <w:rPr>
+          <w:rFonts w:ascii="Arial" w:hAnsi="Arial" w:cs="Arial"/>
+          <w:b/>
+          <w:bCs/>
+        </w:rPr>
+        <w:t xml:space="preserve"> Verziókezelés / Git:</w:t>
+      </w:r>
+    </w:p>
+    <w:p>
+      <w:pPr>
+        <w:ind w:left="708"/>
+        <w:jc w:val="both"/>
+        <w:rPr>
+          <w:rFonts w:ascii="Arial" w:hAnsi="Arial" w:cs="Arial"/>
+        </w:rPr>
+      </w:pPr>
+      <w:r>
+        <w:rPr>
+          <w:rFonts w:ascii="Arial" w:hAnsi="Arial" w:cs="Arial"/>
+        </w:rPr>
+        <w:t>Verziókövetésre a Githubot használtuk. Minden Jirában létrehozott tasknak külön branchet hoztunk létre, a tasknak megfelelő kóddal elnevezve.</w:t>
+      </w:r>
+    </w:p>
+    <w:p>
+      <w:pPr>
+        <w:ind w:left="708"/>
+        <w:jc w:val="both"/>
+        <w:rPr>
+          <w:rFonts w:ascii="Arial" w:hAnsi="Arial" w:cs="Arial"/>
+        </w:rPr>
+      </w:pPr>
+      <w:r>
+        <w:rPr>
+          <w:rFonts w:ascii="Arial" w:hAnsi="Arial" w:cs="Arial"/>
+        </w:rPr>
+        <w:t>A commitolás lépései:</w:t>
+      </w:r>
+    </w:p>
+    <w:p>
+      <w:pPr>
+        <w:pStyle w:val="Listaszerbekezds"/>
+        <w:numPr>
+          <w:ilvl w:val="0"/>
+          <w:numId w:val="2"/>
+        </w:numPr>
+        <w:jc w:val="both"/>
+        <w:rPr>
+          <w:rFonts w:ascii="Arial" w:hAnsi="Arial" w:cs="Arial"/>
+        </w:rPr>
+      </w:pPr>
+      <w:r>
+        <w:rPr>
+          <w:rFonts w:ascii="Arial" w:hAnsi="Arial" w:cs="Arial"/>
+        </w:rPr>
+        <w:t>Menjen be a fájlkezelőben a leklónozott mappába.</w:t>
+      </w:r>
+    </w:p>
+    <w:p>
+      <w:pPr>
+        <w:pStyle w:val="Listaszerbekezds"/>
+        <w:numPr>
+          <w:ilvl w:val="0"/>
+          <w:numId w:val="2"/>
+        </w:numPr>
+        <w:jc w:val="both"/>
+        <w:rPr>
+          <w:rFonts w:ascii="Arial" w:hAnsi="Arial" w:cs="Arial"/>
+        </w:rPr>
+      </w:pPr>
+      <w:r>
+        <w:rPr>
+          <w:rFonts w:ascii="Arial" w:hAnsi="Arial" w:cs="Arial"/>
+        </w:rPr>
+        <w:t>A fejlécbe írja be, hogy „cmd” majd nyomjon egy entert.</w:t>
+      </w:r>
+    </w:p>
+    <w:p>
+      <w:pPr>
+        <w:pStyle w:val="Listaszerbekezds"/>
+        <w:numPr>
+          <w:ilvl w:val="0"/>
+          <w:numId w:val="2"/>
+        </w:numPr>
+        <w:jc w:val="both"/>
+        <w:rPr>
+          <w:rFonts w:ascii="Arial" w:hAnsi="Arial" w:cs="Arial"/>
+        </w:rPr>
+      </w:pPr>
+      <w:r>
+        <w:rPr>
+          <w:rFonts w:ascii="Arial" w:hAnsi="Arial" w:cs="Arial"/>
+        </w:rPr>
+        <w:t>A cmd terminálba irja be, hogy „ git add .” és ezután ismét nyomjon egy entert.</w:t>
+      </w:r>
+    </w:p>
+    <w:p>
+      <w:pPr>
+        <w:pStyle w:val="Listaszerbekezds"/>
+        <w:numPr>
+          <w:ilvl w:val="0"/>
+          <w:numId w:val="2"/>
+        </w:numPr>
+        <w:jc w:val="both"/>
+        <w:rPr>
+          <w:rFonts w:ascii="Arial" w:hAnsi="Arial" w:cs="Arial"/>
+        </w:rPr>
+      </w:pPr>
+      <w:r>
+        <w:rPr>
+          <w:rFonts w:ascii="Arial" w:hAnsi="Arial" w:cs="Arial"/>
+        </w:rPr>
+        <w:t>Negyedik lépésben írja be, hogy „git commit -m „Ide írja a commit elnevezését” ” majd nyomjon egy entert ismét.</w:t>
+      </w:r>
+    </w:p>
+    <w:p>
+      <w:pPr>
+        <w:pStyle w:val="Listaszerbekezds"/>
+        <w:numPr>
+          <w:ilvl w:val="0"/>
+          <w:numId w:val="2"/>
+        </w:numPr>
+        <w:jc w:val="both"/>
+        <w:rPr>
+          <w:rFonts w:ascii="Arial" w:hAnsi="Arial" w:cs="Arial"/>
+        </w:rPr>
+      </w:pPr>
+      <w:r>
+        <w:rPr>
+          <w:rFonts w:ascii="Arial" w:hAnsi="Arial" w:cs="Arial"/>
+        </w:rPr>
+        <w:t>Utolsó lépésben írja be, hogy „git push”, nyomjon egy entert és készen is van.</w:t>
+      </w:r>
     </w:p>
     <w:sectPr>
       <w:pgSz w:w="11906" w:h="16838"/>
@@ -1029,7 +1414,7 @@
         <w:rFonts w:hint="default"/>
       </w:rPr>
     </w:lvl>
-    <w:lvl w:ilvl="1" w:tplc="040E0019" w:tentative="1">
+    <w:lvl w:ilvl="1" w:tplc="040E0019">
       <w:start w:val="1"/>
       <w:numFmt w:val="lowerLetter"/>
       <w:lvlText w:val="%2."/>

</xml_diff>

<commit_message>
Fejlesztői dokumentum 5. pontjának megírása
</commit_message>
<xml_diff>
--- a/Dokumentumok/Dokumentáció/fejlesztői_dokumentáció.docx
+++ b/Dokumentumok/Dokumentáció/fejlesztői_dokumentáció.docx
@@ -4968,19 +4968,7 @@
           <w:lang w:eastAsia="hu-HU"/>
           <w14:ligatures w14:val="none"/>
         </w:rPr>
-        <w:t>” és „status” mezőt a kapott értékkel</w:t>
-      </w:r>
-      <w:r>
-        <w:rPr>
-          <w:rFonts w:ascii="Consolas" w:eastAsia="Times New Roman" w:hAnsi="Consolas" w:cs="Times New Roman"/>
-          <w:color w:val="CCCCCC"/>
-          <w:kern w:val="0"/>
-          <w:sz w:val="21"/>
-          <w:szCs w:val="21"/>
-          <w:lang w:eastAsia="hu-HU"/>
-          <w14:ligatures w14:val="none"/>
-        </w:rPr>
-        <w:t>, ahol az „</w:t>
+        <w:t>” és „status” mezőt a kapott értékkel, ahol az „</w:t>
       </w:r>
       <w:proofErr w:type="spellStart"/>
       <w:r>
@@ -5686,8 +5674,22 @@
           <w:lang w:eastAsia="hu-HU"/>
           <w14:ligatures w14:val="none"/>
         </w:rPr>
-        <w:t>": "Felhasználó jogosultságai sikeresen módosítva!" }</w:t>
-      </w:r>
+        <w:t>": "Felhasználó jogosultságai sikeresen módosítva!</w:t>
+      </w:r>
+      <w:proofErr w:type="gramStart"/>
+      <w:r>
+        <w:rPr>
+          <w:rFonts w:ascii="Consolas" w:eastAsia="Times New Roman" w:hAnsi="Consolas" w:cs="Times New Roman"/>
+          <w:color w:val="CCCCCC"/>
+          <w:kern w:val="0"/>
+          <w:sz w:val="21"/>
+          <w:szCs w:val="21"/>
+          <w:lang w:eastAsia="hu-HU"/>
+          <w14:ligatures w14:val="none"/>
+        </w:rPr>
+        <w:t>" }</w:t>
+      </w:r>
+      <w:proofErr w:type="gramEnd"/>
     </w:p>
     <w:p>
       <w:pPr>
@@ -5911,31 +5913,7 @@
           <w:lang w:eastAsia="hu-HU"/>
           <w14:ligatures w14:val="none"/>
         </w:rPr>
-        <w:t xml:space="preserve"> – frissíti a</w:t>
-      </w:r>
-      <w:r>
-        <w:rPr>
-          <w:rFonts w:ascii="Consolas" w:eastAsia="Times New Roman" w:hAnsi="Consolas" w:cs="Times New Roman"/>
-          <w:color w:val="CCCCCC"/>
-          <w:kern w:val="0"/>
-          <w:sz w:val="21"/>
-          <w:szCs w:val="21"/>
-          <w:lang w:eastAsia="hu-HU"/>
-          <w14:ligatures w14:val="none"/>
-        </w:rPr>
-        <w:t xml:space="preserve">z „email” </w:t>
-      </w:r>
-      <w:r>
-        <w:rPr>
-          <w:rFonts w:ascii="Consolas" w:eastAsia="Times New Roman" w:hAnsi="Consolas" w:cs="Times New Roman"/>
-          <w:color w:val="CCCCCC"/>
-          <w:kern w:val="0"/>
-          <w:sz w:val="21"/>
-          <w:szCs w:val="21"/>
-          <w:lang w:eastAsia="hu-HU"/>
-          <w14:ligatures w14:val="none"/>
-        </w:rPr>
-        <w:t>mezőt a kapott értékkel, ahol az „</w:t>
+        <w:t xml:space="preserve"> – frissíti az „email” mezőt a kapott értékkel, ahol az „</w:t>
       </w:r>
       <w:proofErr w:type="spellStart"/>
       <w:r>
@@ -6780,19 +6758,7 @@
           <w:lang w:eastAsia="hu-HU"/>
           <w14:ligatures w14:val="none"/>
         </w:rPr>
-        <w:t xml:space="preserve">” </w:t>
-      </w:r>
-      <w:r>
-        <w:rPr>
-          <w:rFonts w:ascii="Consolas" w:eastAsia="Times New Roman" w:hAnsi="Consolas" w:cs="Times New Roman"/>
-          <w:color w:val="CCCCCC"/>
-          <w:kern w:val="0"/>
-          <w:sz w:val="21"/>
-          <w:szCs w:val="21"/>
-          <w:lang w:eastAsia="hu-HU"/>
-          <w14:ligatures w14:val="none"/>
-        </w:rPr>
-        <w:t>mezőt a kapott értékkel, ahol az „</w:t>
+        <w:t>” mezőt a kapott értékkel, ahol az „</w:t>
       </w:r>
       <w:proofErr w:type="spellStart"/>
       <w:r>
@@ -11319,8 +11285,22 @@
           <w:lang w:eastAsia="hu-HU"/>
           <w14:ligatures w14:val="none"/>
         </w:rPr>
-        <w:t>": "Esemény létrehozása sikeres!" }</w:t>
-      </w:r>
+        <w:t>": "Esemény létrehozása sikeres!</w:t>
+      </w:r>
+      <w:proofErr w:type="gramStart"/>
+      <w:r>
+        <w:rPr>
+          <w:rFonts w:ascii="Consolas" w:eastAsia="Times New Roman" w:hAnsi="Consolas" w:cs="Times New Roman"/>
+          <w:color w:val="CCCCCC"/>
+          <w:kern w:val="0"/>
+          <w:sz w:val="21"/>
+          <w:szCs w:val="21"/>
+          <w:lang w:eastAsia="hu-HU"/>
+          <w14:ligatures w14:val="none"/>
+        </w:rPr>
+        <w:t>" }</w:t>
+      </w:r>
+      <w:proofErr w:type="gramEnd"/>
     </w:p>
     <w:p>
       <w:pPr>
@@ -13123,58 +13103,34 @@
           <w:lang w:eastAsia="hu-HU"/>
           <w14:ligatures w14:val="none"/>
         </w:rPr>
-        <w:t xml:space="preserve"> </w:t>
-      </w:r>
-      <w:r>
-        <w:rPr>
-          <w:rFonts w:ascii="Consolas" w:eastAsia="Times New Roman" w:hAnsi="Consolas" w:cs="Times New Roman"/>
-          <w:color w:val="CCCCCC"/>
-          <w:kern w:val="0"/>
-          <w:sz w:val="21"/>
-          <w:szCs w:val="21"/>
-          <w:lang w:eastAsia="hu-HU"/>
-          <w14:ligatures w14:val="none"/>
-        </w:rPr>
-        <w:t>5d4ead95-2241-45e9-9080-f033cbc3f66f</w:t>
-      </w:r>
-    </w:p>
-    <w:p>
-      <w:pPr>
-        <w:shd w:val="clear" w:color="auto" w:fill="1F1F1F"/>
-        <w:spacing w:after="0" w:line="285" w:lineRule="atLeast"/>
-        <w:rPr>
-          <w:rFonts w:ascii="Consolas" w:eastAsia="Times New Roman" w:hAnsi="Consolas" w:cs="Times New Roman"/>
-          <w:color w:val="CCCCCC"/>
-          <w:kern w:val="0"/>
-          <w:sz w:val="21"/>
-          <w:szCs w:val="21"/>
-          <w:lang w:eastAsia="hu-HU"/>
-          <w14:ligatures w14:val="none"/>
-        </w:rPr>
-      </w:pPr>
-      <w:r>
-        <w:rPr>
-          <w:rFonts w:ascii="Consolas" w:eastAsia="Times New Roman" w:hAnsi="Consolas" w:cs="Times New Roman"/>
-          <w:color w:val="CCCCCC"/>
-          <w:kern w:val="0"/>
-          <w:sz w:val="21"/>
-          <w:szCs w:val="21"/>
-          <w:lang w:eastAsia="hu-HU"/>
-          <w14:ligatures w14:val="none"/>
-        </w:rPr>
-        <w:t xml:space="preserve">– </w:t>
-      </w:r>
-      <w:r>
-        <w:rPr>
-          <w:rFonts w:ascii="Consolas" w:eastAsia="Times New Roman" w:hAnsi="Consolas" w:cs="Times New Roman"/>
-          <w:color w:val="CCCCCC"/>
-          <w:kern w:val="0"/>
-          <w:sz w:val="21"/>
-          <w:szCs w:val="21"/>
-          <w:lang w:eastAsia="hu-HU"/>
-          <w14:ligatures w14:val="none"/>
-        </w:rPr>
-        <w:t xml:space="preserve">lekéri az adatbázisból azt </w:t>
+        <w:t xml:space="preserve"> 5d4ead95-2241-45e9-9080-f033cbc3f66f</w:t>
+      </w:r>
+    </w:p>
+    <w:p>
+      <w:pPr>
+        <w:shd w:val="clear" w:color="auto" w:fill="1F1F1F"/>
+        <w:spacing w:after="0" w:line="285" w:lineRule="atLeast"/>
+        <w:rPr>
+          <w:rFonts w:ascii="Consolas" w:eastAsia="Times New Roman" w:hAnsi="Consolas" w:cs="Times New Roman"/>
+          <w:color w:val="CCCCCC"/>
+          <w:kern w:val="0"/>
+          <w:sz w:val="21"/>
+          <w:szCs w:val="21"/>
+          <w:lang w:eastAsia="hu-HU"/>
+          <w14:ligatures w14:val="none"/>
+        </w:rPr>
+      </w:pPr>
+      <w:r>
+        <w:rPr>
+          <w:rFonts w:ascii="Consolas" w:eastAsia="Times New Roman" w:hAnsi="Consolas" w:cs="Times New Roman"/>
+          <w:color w:val="CCCCCC"/>
+          <w:kern w:val="0"/>
+          <w:sz w:val="21"/>
+          <w:szCs w:val="21"/>
+          <w:lang w:eastAsia="hu-HU"/>
+          <w14:ligatures w14:val="none"/>
+        </w:rPr>
+        <w:t xml:space="preserve">– lekéri az adatbázisból azt </w:t>
       </w:r>
       <w:proofErr w:type="gramStart"/>
       <w:r>
@@ -13200,31 +13156,7 @@
           <w:lang w:eastAsia="hu-HU"/>
           <w14:ligatures w14:val="none"/>
         </w:rPr>
-        <w:t xml:space="preserve"> </w:t>
-      </w:r>
-      <w:r>
-        <w:rPr>
-          <w:rFonts w:ascii="Consolas" w:eastAsia="Times New Roman" w:hAnsi="Consolas" w:cs="Times New Roman"/>
-          <w:color w:val="CCCCCC"/>
-          <w:kern w:val="0"/>
-          <w:sz w:val="21"/>
-          <w:szCs w:val="21"/>
-          <w:lang w:eastAsia="hu-HU"/>
-          <w14:ligatures w14:val="none"/>
-        </w:rPr>
-        <w:t>eseményt</w:t>
-      </w:r>
-      <w:r>
-        <w:rPr>
-          <w:rFonts w:ascii="Consolas" w:eastAsia="Times New Roman" w:hAnsi="Consolas" w:cs="Times New Roman"/>
-          <w:color w:val="CCCCCC"/>
-          <w:kern w:val="0"/>
-          <w:sz w:val="21"/>
-          <w:szCs w:val="21"/>
-          <w:lang w:eastAsia="hu-HU"/>
-          <w14:ligatures w14:val="none"/>
-        </w:rPr>
-        <w:t>, ahol az „</w:t>
+        <w:t xml:space="preserve"> eseményt, ahol az „</w:t>
       </w:r>
       <w:proofErr w:type="spellStart"/>
       <w:r>
@@ -14228,19 +14160,7 @@
           <w:lang w:eastAsia="hu-HU"/>
           <w14:ligatures w14:val="none"/>
         </w:rPr>
-        <w:t>- Törli</w:t>
-      </w:r>
-      <w:r>
-        <w:rPr>
-          <w:rFonts w:ascii="Consolas" w:eastAsia="Times New Roman" w:hAnsi="Consolas" w:cs="Times New Roman"/>
-          <w:color w:val="CCCCCC"/>
-          <w:kern w:val="0"/>
-          <w:sz w:val="21"/>
-          <w:szCs w:val="21"/>
-          <w:lang w:eastAsia="hu-HU"/>
-          <w14:ligatures w14:val="none"/>
-        </w:rPr>
-        <w:t xml:space="preserve"> az adatbázisból azt </w:t>
+        <w:t xml:space="preserve">- Törli az adatbázisból azt </w:t>
       </w:r>
       <w:proofErr w:type="gramStart"/>
       <w:r>
@@ -14932,31 +14852,7 @@
           <w:lang w:eastAsia="hu-HU"/>
           <w14:ligatures w14:val="none"/>
         </w:rPr>
-        <w:t xml:space="preserve"> - frissíti</w:t>
-      </w:r>
-      <w:r>
-        <w:rPr>
-          <w:rFonts w:ascii="Consolas" w:eastAsia="Times New Roman" w:hAnsi="Consolas" w:cs="Times New Roman"/>
-          <w:color w:val="CCCCCC"/>
-          <w:kern w:val="0"/>
-          <w:sz w:val="21"/>
-          <w:szCs w:val="21"/>
-          <w:lang w:eastAsia="hu-HU"/>
-          <w14:ligatures w14:val="none"/>
-        </w:rPr>
-        <w:t xml:space="preserve"> az </w:t>
-      </w:r>
-      <w:r>
-        <w:rPr>
-          <w:rFonts w:ascii="Consolas" w:eastAsia="Times New Roman" w:hAnsi="Consolas" w:cs="Times New Roman"/>
-          <w:color w:val="CCCCCC"/>
-          <w:kern w:val="0"/>
-          <w:sz w:val="21"/>
-          <w:szCs w:val="21"/>
-          <w:lang w:eastAsia="hu-HU"/>
-          <w14:ligatures w14:val="none"/>
-        </w:rPr>
-        <w:t>„</w:t>
+        <w:t xml:space="preserve"> - frissíti az „</w:t>
       </w:r>
       <w:proofErr w:type="spellStart"/>
       <w:r>
@@ -14982,43 +14878,7 @@
           <w:lang w:eastAsia="hu-HU"/>
           <w14:ligatures w14:val="none"/>
         </w:rPr>
-        <w:t>” táblában, a kapott adatokkal,</w:t>
-      </w:r>
-      <w:r>
-        <w:rPr>
-          <w:rFonts w:ascii="Consolas" w:eastAsia="Times New Roman" w:hAnsi="Consolas" w:cs="Times New Roman"/>
-          <w:color w:val="CCCCCC"/>
-          <w:kern w:val="0"/>
-          <w:sz w:val="21"/>
-          <w:szCs w:val="21"/>
-          <w:lang w:eastAsia="hu-HU"/>
-          <w14:ligatures w14:val="none"/>
-        </w:rPr>
-        <w:t xml:space="preserve"> azt a</w:t>
-      </w:r>
-      <w:r>
-        <w:rPr>
-          <w:rFonts w:ascii="Consolas" w:eastAsia="Times New Roman" w:hAnsi="Consolas" w:cs="Times New Roman"/>
-          <w:color w:val="CCCCCC"/>
-          <w:kern w:val="0"/>
-          <w:sz w:val="21"/>
-          <w:szCs w:val="21"/>
-          <w:lang w:eastAsia="hu-HU"/>
-          <w14:ligatures w14:val="none"/>
-        </w:rPr>
-        <w:t>z</w:t>
-      </w:r>
-      <w:r>
-        <w:rPr>
-          <w:rFonts w:ascii="Consolas" w:eastAsia="Times New Roman" w:hAnsi="Consolas" w:cs="Times New Roman"/>
-          <w:color w:val="CCCCCC"/>
-          <w:kern w:val="0"/>
-          <w:sz w:val="21"/>
-          <w:szCs w:val="21"/>
-          <w:lang w:eastAsia="hu-HU"/>
-          <w14:ligatures w14:val="none"/>
-        </w:rPr>
-        <w:t xml:space="preserve"> eseményt, ahol az „</w:t>
+        <w:t>” táblában, a kapott adatokkal, azt az eseményt, ahol az „</w:t>
       </w:r>
       <w:proofErr w:type="spellStart"/>
       <w:r>
@@ -16957,31 +16817,7 @@
           <w:lang w:eastAsia="hu-HU"/>
           <w14:ligatures w14:val="none"/>
         </w:rPr>
-        <w:t xml:space="preserve"> - </w:t>
-      </w:r>
-      <w:r>
-        <w:rPr>
-          <w:rFonts w:ascii="Consolas" w:eastAsia="Times New Roman" w:hAnsi="Consolas" w:cs="Times New Roman"/>
-          <w:color w:val="CCCCCC"/>
-          <w:kern w:val="0"/>
-          <w:sz w:val="21"/>
-          <w:szCs w:val="21"/>
-          <w:lang w:eastAsia="hu-HU"/>
-          <w14:ligatures w14:val="none"/>
-        </w:rPr>
-        <w:t xml:space="preserve">Törli az </w:t>
-      </w:r>
-      <w:r>
-        <w:rPr>
-          <w:rFonts w:ascii="Consolas" w:eastAsia="Times New Roman" w:hAnsi="Consolas" w:cs="Times New Roman"/>
-          <w:color w:val="CCCCCC"/>
-          <w:kern w:val="0"/>
-          <w:sz w:val="21"/>
-          <w:szCs w:val="21"/>
-          <w:lang w:eastAsia="hu-HU"/>
-          <w14:ligatures w14:val="none"/>
-        </w:rPr>
-        <w:t>„</w:t>
+        <w:t xml:space="preserve"> - Törli az „</w:t>
       </w:r>
       <w:proofErr w:type="spellStart"/>
       <w:r>
@@ -17007,19 +16843,7 @@
           <w:lang w:eastAsia="hu-HU"/>
           <w14:ligatures w14:val="none"/>
         </w:rPr>
-        <w:t>” táblából</w:t>
-      </w:r>
-      <w:r>
-        <w:rPr>
-          <w:rFonts w:ascii="Consolas" w:eastAsia="Times New Roman" w:hAnsi="Consolas" w:cs="Times New Roman"/>
-          <w:color w:val="CCCCCC"/>
-          <w:kern w:val="0"/>
-          <w:sz w:val="21"/>
-          <w:szCs w:val="21"/>
-          <w:lang w:eastAsia="hu-HU"/>
-          <w14:ligatures w14:val="none"/>
-        </w:rPr>
-        <w:t xml:space="preserve"> azt </w:t>
+        <w:t xml:space="preserve">” táblából azt </w:t>
       </w:r>
       <w:proofErr w:type="gramStart"/>
       <w:r>
@@ -17045,31 +16869,7 @@
           <w:lang w:eastAsia="hu-HU"/>
           <w14:ligatures w14:val="none"/>
         </w:rPr>
-        <w:t xml:space="preserve"> </w:t>
-      </w:r>
-      <w:r>
-        <w:rPr>
-          <w:rFonts w:ascii="Consolas" w:eastAsia="Times New Roman" w:hAnsi="Consolas" w:cs="Times New Roman"/>
-          <w:color w:val="CCCCCC"/>
-          <w:kern w:val="0"/>
-          <w:sz w:val="21"/>
-          <w:szCs w:val="21"/>
-          <w:lang w:eastAsia="hu-HU"/>
-          <w14:ligatures w14:val="none"/>
-        </w:rPr>
-        <w:t>értékelést</w:t>
-      </w:r>
-      <w:r>
-        <w:rPr>
-          <w:rFonts w:ascii="Consolas" w:eastAsia="Times New Roman" w:hAnsi="Consolas" w:cs="Times New Roman"/>
-          <w:color w:val="CCCCCC"/>
-          <w:kern w:val="0"/>
-          <w:sz w:val="21"/>
-          <w:szCs w:val="21"/>
-          <w:lang w:eastAsia="hu-HU"/>
-          <w14:ligatures w14:val="none"/>
-        </w:rPr>
-        <w:t>, ahol az „</w:t>
+        <w:t xml:space="preserve"> értékelést, ahol az „</w:t>
       </w:r>
       <w:proofErr w:type="spellStart"/>
       <w:r>
@@ -25534,13 +25334,1034 @@
     </w:p>
     <w:p>
       <w:pPr>
-        <w:pStyle w:val="Listaszerbekezds"/>
+        <w:ind w:left="360"/>
         <w:rPr>
           <w:rFonts w:ascii="Arial" w:hAnsi="Arial" w:cs="Arial"/>
           <w:b/>
           <w:bCs/>
         </w:rPr>
       </w:pPr>
+      <w:proofErr w:type="spellStart"/>
+      <w:r>
+        <w:rPr>
+          <w:rFonts w:ascii="Arial" w:hAnsi="Arial" w:cs="Arial"/>
+          <w:b/>
+          <w:bCs/>
+        </w:rPr>
+        <w:t>users</w:t>
+      </w:r>
+      <w:proofErr w:type="spellEnd"/>
+      <w:r>
+        <w:rPr>
+          <w:rFonts w:ascii="Arial" w:hAnsi="Arial" w:cs="Arial"/>
+          <w:b/>
+          <w:bCs/>
+        </w:rPr>
+        <w:t>:</w:t>
+      </w:r>
+    </w:p>
+    <w:p>
+      <w:pPr>
+        <w:pStyle w:val="Listaszerbekezds"/>
+        <w:numPr>
+          <w:ilvl w:val="0"/>
+          <w:numId w:val="2"/>
+        </w:numPr>
+        <w:rPr>
+          <w:rFonts w:ascii="Arial" w:hAnsi="Arial" w:cs="Arial"/>
+        </w:rPr>
+      </w:pPr>
+      <w:proofErr w:type="spellStart"/>
+      <w:r>
+        <w:rPr>
+          <w:rFonts w:ascii="Arial" w:hAnsi="Arial" w:cs="Arial"/>
+        </w:rPr>
+        <w:t>id</w:t>
+      </w:r>
+      <w:proofErr w:type="spellEnd"/>
+      <w:r>
+        <w:rPr>
+          <w:rFonts w:ascii="Arial" w:hAnsi="Arial" w:cs="Arial"/>
+        </w:rPr>
+        <w:t xml:space="preserve"> – INT, elsődleges kulcs (PRIMARY KEY), AUTO_INCREMENT</w:t>
+      </w:r>
+    </w:p>
+    <w:p>
+      <w:pPr>
+        <w:pStyle w:val="Listaszerbekezds"/>
+        <w:numPr>
+          <w:ilvl w:val="0"/>
+          <w:numId w:val="2"/>
+        </w:numPr>
+        <w:rPr>
+          <w:rFonts w:ascii="Arial" w:hAnsi="Arial" w:cs="Arial"/>
+        </w:rPr>
+      </w:pPr>
+      <w:proofErr w:type="spellStart"/>
+      <w:r>
+        <w:rPr>
+          <w:rFonts w:ascii="Arial" w:hAnsi="Arial" w:cs="Arial"/>
+        </w:rPr>
+        <w:t>name</w:t>
+      </w:r>
+      <w:proofErr w:type="spellEnd"/>
+      <w:r>
+        <w:rPr>
+          <w:rFonts w:ascii="Arial" w:hAnsi="Arial" w:cs="Arial"/>
+        </w:rPr>
+        <w:t xml:space="preserve"> – </w:t>
+      </w:r>
+      <w:proofErr w:type="gramStart"/>
+      <w:r>
+        <w:rPr>
+          <w:rFonts w:ascii="Arial" w:hAnsi="Arial" w:cs="Arial"/>
+        </w:rPr>
+        <w:t>VARCHAR(</w:t>
+      </w:r>
+      <w:proofErr w:type="gramEnd"/>
+      <w:r>
+        <w:rPr>
+          <w:rFonts w:ascii="Arial" w:hAnsi="Arial" w:cs="Arial"/>
+        </w:rPr>
+        <w:t>255)</w:t>
+      </w:r>
+    </w:p>
+    <w:p>
+      <w:pPr>
+        <w:pStyle w:val="Listaszerbekezds"/>
+        <w:numPr>
+          <w:ilvl w:val="0"/>
+          <w:numId w:val="2"/>
+        </w:numPr>
+        <w:rPr>
+          <w:rFonts w:ascii="Arial" w:hAnsi="Arial" w:cs="Arial"/>
+        </w:rPr>
+      </w:pPr>
+      <w:r>
+        <w:rPr>
+          <w:rFonts w:ascii="Arial" w:hAnsi="Arial" w:cs="Arial"/>
+        </w:rPr>
+        <w:lastRenderedPageBreak/>
+        <w:t xml:space="preserve">email – </w:t>
+      </w:r>
+      <w:proofErr w:type="gramStart"/>
+      <w:r>
+        <w:rPr>
+          <w:rFonts w:ascii="Arial" w:hAnsi="Arial" w:cs="Arial"/>
+        </w:rPr>
+        <w:t>VARCHAR(</w:t>
+      </w:r>
+      <w:proofErr w:type="gramEnd"/>
+      <w:r>
+        <w:rPr>
+          <w:rFonts w:ascii="Arial" w:hAnsi="Arial" w:cs="Arial"/>
+        </w:rPr>
+        <w:t>255)</w:t>
+      </w:r>
+    </w:p>
+    <w:p>
+      <w:pPr>
+        <w:pStyle w:val="Listaszerbekezds"/>
+        <w:numPr>
+          <w:ilvl w:val="0"/>
+          <w:numId w:val="2"/>
+        </w:numPr>
+        <w:rPr>
+          <w:rFonts w:ascii="Arial" w:hAnsi="Arial" w:cs="Arial"/>
+        </w:rPr>
+      </w:pPr>
+      <w:proofErr w:type="spellStart"/>
+      <w:r>
+        <w:rPr>
+          <w:rFonts w:ascii="Arial" w:hAnsi="Arial" w:cs="Arial"/>
+        </w:rPr>
+        <w:t>password</w:t>
+      </w:r>
+      <w:proofErr w:type="spellEnd"/>
+      <w:r>
+        <w:rPr>
+          <w:rFonts w:ascii="Arial" w:hAnsi="Arial" w:cs="Arial"/>
+        </w:rPr>
+        <w:t xml:space="preserve"> – </w:t>
+      </w:r>
+      <w:proofErr w:type="gramStart"/>
+      <w:r>
+        <w:rPr>
+          <w:rFonts w:ascii="Arial" w:hAnsi="Arial" w:cs="Arial"/>
+        </w:rPr>
+        <w:t>VARCHAR(</w:t>
+      </w:r>
+      <w:proofErr w:type="gramEnd"/>
+      <w:r>
+        <w:rPr>
+          <w:rFonts w:ascii="Arial" w:hAnsi="Arial" w:cs="Arial"/>
+        </w:rPr>
+        <w:t>255)</w:t>
+      </w:r>
+    </w:p>
+    <w:p>
+      <w:pPr>
+        <w:pStyle w:val="Listaszerbekezds"/>
+        <w:numPr>
+          <w:ilvl w:val="0"/>
+          <w:numId w:val="2"/>
+        </w:numPr>
+        <w:rPr>
+          <w:rFonts w:ascii="Arial" w:hAnsi="Arial" w:cs="Arial"/>
+        </w:rPr>
+      </w:pPr>
+      <w:proofErr w:type="spellStart"/>
+      <w:r>
+        <w:rPr>
+          <w:rFonts w:ascii="Arial" w:hAnsi="Arial" w:cs="Arial"/>
+        </w:rPr>
+        <w:t>role</w:t>
+      </w:r>
+      <w:proofErr w:type="spellEnd"/>
+      <w:r>
+        <w:rPr>
+          <w:rFonts w:ascii="Arial" w:hAnsi="Arial" w:cs="Arial"/>
+        </w:rPr>
+        <w:t xml:space="preserve"> – ENUM('</w:t>
+      </w:r>
+      <w:proofErr w:type="spellStart"/>
+      <w:r>
+        <w:rPr>
+          <w:rFonts w:ascii="Arial" w:hAnsi="Arial" w:cs="Arial"/>
+        </w:rPr>
+        <w:t>user</w:t>
+      </w:r>
+      <w:proofErr w:type="spellEnd"/>
+      <w:r>
+        <w:rPr>
+          <w:rFonts w:ascii="Arial" w:hAnsi="Arial" w:cs="Arial"/>
+        </w:rPr>
+        <w:t>','</w:t>
+      </w:r>
+      <w:proofErr w:type="spellStart"/>
+      <w:r>
+        <w:rPr>
+          <w:rFonts w:ascii="Arial" w:hAnsi="Arial" w:cs="Arial"/>
+        </w:rPr>
+        <w:t>admin</w:t>
+      </w:r>
+      <w:proofErr w:type="spellEnd"/>
+      <w:r>
+        <w:rPr>
+          <w:rFonts w:ascii="Arial" w:hAnsi="Arial" w:cs="Arial"/>
+        </w:rPr>
+        <w:t>')</w:t>
+      </w:r>
+    </w:p>
+    <w:p>
+      <w:pPr>
+        <w:rPr>
+          <w:rFonts w:ascii="Arial" w:hAnsi="Arial" w:cs="Arial"/>
+          <w:b/>
+          <w:bCs/>
+        </w:rPr>
+      </w:pPr>
+      <w:proofErr w:type="spellStart"/>
+      <w:r>
+        <w:rPr>
+          <w:rFonts w:ascii="Arial" w:hAnsi="Arial" w:cs="Arial"/>
+          <w:b/>
+          <w:bCs/>
+        </w:rPr>
+        <w:t>categories</w:t>
+      </w:r>
+      <w:proofErr w:type="spellEnd"/>
+    </w:p>
+    <w:p>
+      <w:pPr>
+        <w:pStyle w:val="Listaszerbekezds"/>
+        <w:numPr>
+          <w:ilvl w:val="0"/>
+          <w:numId w:val="2"/>
+        </w:numPr>
+        <w:rPr>
+          <w:rFonts w:ascii="Arial" w:hAnsi="Arial" w:cs="Arial"/>
+        </w:rPr>
+      </w:pPr>
+      <w:proofErr w:type="spellStart"/>
+      <w:r>
+        <w:rPr>
+          <w:rFonts w:ascii="Arial" w:hAnsi="Arial" w:cs="Arial"/>
+        </w:rPr>
+        <w:t>id</w:t>
+      </w:r>
+      <w:proofErr w:type="spellEnd"/>
+      <w:r>
+        <w:rPr>
+          <w:rFonts w:ascii="Arial" w:hAnsi="Arial" w:cs="Arial"/>
+        </w:rPr>
+        <w:t xml:space="preserve"> – INT, elsődleges kulcs, AUTO_INCREMENT</w:t>
+      </w:r>
+    </w:p>
+    <w:p>
+      <w:pPr>
+        <w:pStyle w:val="Listaszerbekezds"/>
+        <w:numPr>
+          <w:ilvl w:val="0"/>
+          <w:numId w:val="2"/>
+        </w:numPr>
+        <w:rPr>
+          <w:rFonts w:ascii="Arial" w:hAnsi="Arial" w:cs="Arial"/>
+        </w:rPr>
+      </w:pPr>
+      <w:proofErr w:type="spellStart"/>
+      <w:r>
+        <w:rPr>
+          <w:rFonts w:ascii="Arial" w:hAnsi="Arial" w:cs="Arial"/>
+        </w:rPr>
+        <w:t>name</w:t>
+      </w:r>
+      <w:proofErr w:type="spellEnd"/>
+      <w:r>
+        <w:rPr>
+          <w:rFonts w:ascii="Arial" w:hAnsi="Arial" w:cs="Arial"/>
+        </w:rPr>
+        <w:t xml:space="preserve"> – </w:t>
+      </w:r>
+      <w:proofErr w:type="gramStart"/>
+      <w:r>
+        <w:rPr>
+          <w:rFonts w:ascii="Arial" w:hAnsi="Arial" w:cs="Arial"/>
+        </w:rPr>
+        <w:t>VARCHAR(</w:t>
+      </w:r>
+      <w:proofErr w:type="gramEnd"/>
+      <w:r>
+        <w:rPr>
+          <w:rFonts w:ascii="Arial" w:hAnsi="Arial" w:cs="Arial"/>
+        </w:rPr>
+        <w:t>255)</w:t>
+      </w:r>
+    </w:p>
+    <w:p>
+      <w:pPr>
+        <w:rPr>
+          <w:rFonts w:ascii="Arial" w:hAnsi="Arial" w:cs="Arial"/>
+          <w:b/>
+          <w:bCs/>
+        </w:rPr>
+      </w:pPr>
+      <w:proofErr w:type="spellStart"/>
+      <w:r>
+        <w:rPr>
+          <w:rFonts w:ascii="Arial" w:hAnsi="Arial" w:cs="Arial"/>
+          <w:b/>
+          <w:bCs/>
+        </w:rPr>
+        <w:t>events</w:t>
+      </w:r>
+      <w:proofErr w:type="spellEnd"/>
+    </w:p>
+    <w:p>
+      <w:pPr>
+        <w:pStyle w:val="Listaszerbekezds"/>
+        <w:numPr>
+          <w:ilvl w:val="0"/>
+          <w:numId w:val="2"/>
+        </w:numPr>
+        <w:rPr>
+          <w:rFonts w:ascii="Arial" w:hAnsi="Arial" w:cs="Arial"/>
+        </w:rPr>
+      </w:pPr>
+      <w:proofErr w:type="spellStart"/>
+      <w:r>
+        <w:rPr>
+          <w:rFonts w:ascii="Arial" w:hAnsi="Arial" w:cs="Arial"/>
+        </w:rPr>
+        <w:t>i</w:t>
+      </w:r>
+      <w:r>
+        <w:rPr>
+          <w:rFonts w:ascii="Arial" w:hAnsi="Arial" w:cs="Arial"/>
+        </w:rPr>
+        <w:t>d</w:t>
+      </w:r>
+      <w:proofErr w:type="spellEnd"/>
+      <w:r>
+        <w:rPr>
+          <w:rFonts w:ascii="Arial" w:hAnsi="Arial" w:cs="Arial"/>
+        </w:rPr>
+        <w:t xml:space="preserve"> – INT, elsődleges kulcs, AUTO_INCREMENT</w:t>
+      </w:r>
+    </w:p>
+    <w:p>
+      <w:pPr>
+        <w:pStyle w:val="Listaszerbekezds"/>
+        <w:numPr>
+          <w:ilvl w:val="0"/>
+          <w:numId w:val="2"/>
+        </w:numPr>
+        <w:rPr>
+          <w:rFonts w:ascii="Arial" w:hAnsi="Arial" w:cs="Arial"/>
+        </w:rPr>
+      </w:pPr>
+      <w:proofErr w:type="spellStart"/>
+      <w:r>
+        <w:rPr>
+          <w:rFonts w:ascii="Arial" w:hAnsi="Arial" w:cs="Arial"/>
+        </w:rPr>
+        <w:t>user_id</w:t>
+      </w:r>
+      <w:proofErr w:type="spellEnd"/>
+      <w:r>
+        <w:rPr>
+          <w:rFonts w:ascii="Arial" w:hAnsi="Arial" w:cs="Arial"/>
+        </w:rPr>
+        <w:t xml:space="preserve"> – INT, idegen kulcs (kapcsolat a users.id-re)</w:t>
+      </w:r>
+    </w:p>
+    <w:p>
+      <w:pPr>
+        <w:pStyle w:val="Listaszerbekezds"/>
+        <w:numPr>
+          <w:ilvl w:val="0"/>
+          <w:numId w:val="2"/>
+        </w:numPr>
+        <w:rPr>
+          <w:rFonts w:ascii="Arial" w:hAnsi="Arial" w:cs="Arial"/>
+        </w:rPr>
+      </w:pPr>
+      <w:proofErr w:type="spellStart"/>
+      <w:r>
+        <w:rPr>
+          <w:rFonts w:ascii="Arial" w:hAnsi="Arial" w:cs="Arial"/>
+        </w:rPr>
+        <w:t>title</w:t>
+      </w:r>
+      <w:proofErr w:type="spellEnd"/>
+      <w:r>
+        <w:rPr>
+          <w:rFonts w:ascii="Arial" w:hAnsi="Arial" w:cs="Arial"/>
+        </w:rPr>
+        <w:t xml:space="preserve"> – </w:t>
+      </w:r>
+      <w:proofErr w:type="gramStart"/>
+      <w:r>
+        <w:rPr>
+          <w:rFonts w:ascii="Arial" w:hAnsi="Arial" w:cs="Arial"/>
+        </w:rPr>
+        <w:t>VARCHAR(</w:t>
+      </w:r>
+      <w:proofErr w:type="gramEnd"/>
+      <w:r>
+        <w:rPr>
+          <w:rFonts w:ascii="Arial" w:hAnsi="Arial" w:cs="Arial"/>
+        </w:rPr>
+        <w:t>255)</w:t>
+      </w:r>
+    </w:p>
+    <w:p>
+      <w:pPr>
+        <w:pStyle w:val="Listaszerbekezds"/>
+        <w:numPr>
+          <w:ilvl w:val="0"/>
+          <w:numId w:val="2"/>
+        </w:numPr>
+        <w:rPr>
+          <w:rFonts w:ascii="Arial" w:hAnsi="Arial" w:cs="Arial"/>
+        </w:rPr>
+      </w:pPr>
+      <w:proofErr w:type="spellStart"/>
+      <w:r>
+        <w:rPr>
+          <w:rFonts w:ascii="Arial" w:hAnsi="Arial" w:cs="Arial"/>
+        </w:rPr>
+        <w:t>description</w:t>
+      </w:r>
+      <w:proofErr w:type="spellEnd"/>
+      <w:r>
+        <w:rPr>
+          <w:rFonts w:ascii="Arial" w:hAnsi="Arial" w:cs="Arial"/>
+        </w:rPr>
+        <w:t xml:space="preserve"> – TEXT</w:t>
+      </w:r>
+    </w:p>
+    <w:p>
+      <w:pPr>
+        <w:pStyle w:val="Listaszerbekezds"/>
+        <w:numPr>
+          <w:ilvl w:val="0"/>
+          <w:numId w:val="2"/>
+        </w:numPr>
+        <w:rPr>
+          <w:rFonts w:ascii="Arial" w:hAnsi="Arial" w:cs="Arial"/>
+        </w:rPr>
+      </w:pPr>
+      <w:proofErr w:type="spellStart"/>
+      <w:r>
+        <w:rPr>
+          <w:rFonts w:ascii="Arial" w:hAnsi="Arial" w:cs="Arial"/>
+        </w:rPr>
+        <w:t>location</w:t>
+      </w:r>
+      <w:proofErr w:type="spellEnd"/>
+      <w:r>
+        <w:rPr>
+          <w:rFonts w:ascii="Arial" w:hAnsi="Arial" w:cs="Arial"/>
+        </w:rPr>
+        <w:t xml:space="preserve"> – </w:t>
+      </w:r>
+      <w:proofErr w:type="gramStart"/>
+      <w:r>
+        <w:rPr>
+          <w:rFonts w:ascii="Arial" w:hAnsi="Arial" w:cs="Arial"/>
+        </w:rPr>
+        <w:t>VARCHAR(</w:t>
+      </w:r>
+      <w:proofErr w:type="gramEnd"/>
+      <w:r>
+        <w:rPr>
+          <w:rFonts w:ascii="Arial" w:hAnsi="Arial" w:cs="Arial"/>
+        </w:rPr>
+        <w:t>255)</w:t>
+      </w:r>
+    </w:p>
+    <w:p>
+      <w:pPr>
+        <w:pStyle w:val="Listaszerbekezds"/>
+        <w:numPr>
+          <w:ilvl w:val="0"/>
+          <w:numId w:val="2"/>
+        </w:numPr>
+        <w:rPr>
+          <w:rFonts w:ascii="Arial" w:hAnsi="Arial" w:cs="Arial"/>
+        </w:rPr>
+      </w:pPr>
+      <w:proofErr w:type="spellStart"/>
+      <w:r>
+        <w:rPr>
+          <w:rFonts w:ascii="Arial" w:hAnsi="Arial" w:cs="Arial"/>
+        </w:rPr>
+        <w:t>start_time</w:t>
+      </w:r>
+      <w:proofErr w:type="spellEnd"/>
+      <w:r>
+        <w:rPr>
+          <w:rFonts w:ascii="Arial" w:hAnsi="Arial" w:cs="Arial"/>
+        </w:rPr>
+        <w:t xml:space="preserve"> – DATETIME</w:t>
+      </w:r>
+    </w:p>
+    <w:p>
+      <w:pPr>
+        <w:pStyle w:val="Listaszerbekezds"/>
+        <w:numPr>
+          <w:ilvl w:val="0"/>
+          <w:numId w:val="2"/>
+        </w:numPr>
+        <w:rPr>
+          <w:rFonts w:ascii="Arial" w:hAnsi="Arial" w:cs="Arial"/>
+        </w:rPr>
+      </w:pPr>
+      <w:proofErr w:type="spellStart"/>
+      <w:r>
+        <w:rPr>
+          <w:rFonts w:ascii="Arial" w:hAnsi="Arial" w:cs="Arial"/>
+        </w:rPr>
+        <w:t>end_time</w:t>
+      </w:r>
+      <w:proofErr w:type="spellEnd"/>
+      <w:r>
+        <w:rPr>
+          <w:rFonts w:ascii="Arial" w:hAnsi="Arial" w:cs="Arial"/>
+        </w:rPr>
+        <w:t xml:space="preserve"> – DATETIME</w:t>
+      </w:r>
+    </w:p>
+    <w:p>
+      <w:pPr>
+        <w:pStyle w:val="Listaszerbekezds"/>
+        <w:numPr>
+          <w:ilvl w:val="0"/>
+          <w:numId w:val="2"/>
+        </w:numPr>
+        <w:rPr>
+          <w:rFonts w:ascii="Arial" w:hAnsi="Arial" w:cs="Arial"/>
+        </w:rPr>
+      </w:pPr>
+      <w:proofErr w:type="spellStart"/>
+      <w:r>
+        <w:rPr>
+          <w:rFonts w:ascii="Arial" w:hAnsi="Arial" w:cs="Arial"/>
+        </w:rPr>
+        <w:t>category_id</w:t>
+      </w:r>
+      <w:proofErr w:type="spellEnd"/>
+      <w:r>
+        <w:rPr>
+          <w:rFonts w:ascii="Arial" w:hAnsi="Arial" w:cs="Arial"/>
+        </w:rPr>
+        <w:t xml:space="preserve"> – INT, idegen kulcs (kapcsolat a categories.id-re)</w:t>
+      </w:r>
+    </w:p>
+    <w:p>
+      <w:pPr>
+        <w:pStyle w:val="Listaszerbekezds"/>
+        <w:numPr>
+          <w:ilvl w:val="0"/>
+          <w:numId w:val="2"/>
+        </w:numPr>
+        <w:rPr>
+          <w:rFonts w:ascii="Arial" w:hAnsi="Arial" w:cs="Arial"/>
+        </w:rPr>
+      </w:pPr>
+      <w:r>
+        <w:rPr>
+          <w:rFonts w:ascii="Arial" w:hAnsi="Arial" w:cs="Arial"/>
+        </w:rPr>
+        <w:t xml:space="preserve">image – </w:t>
+      </w:r>
+      <w:proofErr w:type="gramStart"/>
+      <w:r>
+        <w:rPr>
+          <w:rFonts w:ascii="Arial" w:hAnsi="Arial" w:cs="Arial"/>
+        </w:rPr>
+        <w:t>VARCHAR(</w:t>
+      </w:r>
+      <w:proofErr w:type="gramEnd"/>
+      <w:r>
+        <w:rPr>
+          <w:rFonts w:ascii="Arial" w:hAnsi="Arial" w:cs="Arial"/>
+        </w:rPr>
+        <w:t>255)</w:t>
+      </w:r>
+    </w:p>
+    <w:p>
+      <w:pPr>
+        <w:pStyle w:val="Listaszerbekezds"/>
+        <w:numPr>
+          <w:ilvl w:val="0"/>
+          <w:numId w:val="2"/>
+        </w:numPr>
+        <w:rPr>
+          <w:rFonts w:ascii="Arial" w:hAnsi="Arial" w:cs="Arial"/>
+        </w:rPr>
+      </w:pPr>
+      <w:proofErr w:type="spellStart"/>
+      <w:r>
+        <w:rPr>
+          <w:rFonts w:ascii="Arial" w:hAnsi="Arial" w:cs="Arial"/>
+        </w:rPr>
+        <w:t>created_at</w:t>
+      </w:r>
+      <w:proofErr w:type="spellEnd"/>
+      <w:r>
+        <w:rPr>
+          <w:rFonts w:ascii="Arial" w:hAnsi="Arial" w:cs="Arial"/>
+        </w:rPr>
+        <w:t xml:space="preserve"> – TIMESTAMP, alapértelmezett CURRENT_TIMESTAMP</w:t>
+      </w:r>
+    </w:p>
+    <w:p>
+      <w:pPr>
+        <w:rPr>
+          <w:rFonts w:ascii="Arial" w:hAnsi="Arial" w:cs="Arial"/>
+          <w:b/>
+          <w:bCs/>
+        </w:rPr>
+      </w:pPr>
+      <w:proofErr w:type="spellStart"/>
+      <w:r>
+        <w:rPr>
+          <w:rFonts w:ascii="Arial" w:hAnsi="Arial" w:cs="Arial"/>
+          <w:b/>
+          <w:bCs/>
+        </w:rPr>
+        <w:t>registrations</w:t>
+      </w:r>
+      <w:proofErr w:type="spellEnd"/>
+    </w:p>
+    <w:p>
+      <w:pPr>
+        <w:pStyle w:val="Listaszerbekezds"/>
+        <w:numPr>
+          <w:ilvl w:val="0"/>
+          <w:numId w:val="2"/>
+        </w:numPr>
+        <w:rPr>
+          <w:rFonts w:ascii="Arial" w:hAnsi="Arial" w:cs="Arial"/>
+        </w:rPr>
+      </w:pPr>
+      <w:proofErr w:type="spellStart"/>
+      <w:r>
+        <w:rPr>
+          <w:rFonts w:ascii="Arial" w:hAnsi="Arial" w:cs="Arial"/>
+        </w:rPr>
+        <w:t>id</w:t>
+      </w:r>
+      <w:proofErr w:type="spellEnd"/>
+      <w:r>
+        <w:rPr>
+          <w:rFonts w:ascii="Arial" w:hAnsi="Arial" w:cs="Arial"/>
+        </w:rPr>
+        <w:t xml:space="preserve"> – INT, elsődleges kulcs, AUTO_INCREMENT</w:t>
+      </w:r>
+    </w:p>
+    <w:p>
+      <w:pPr>
+        <w:pStyle w:val="Listaszerbekezds"/>
+        <w:numPr>
+          <w:ilvl w:val="0"/>
+          <w:numId w:val="2"/>
+        </w:numPr>
+        <w:rPr>
+          <w:rFonts w:ascii="Arial" w:hAnsi="Arial" w:cs="Arial"/>
+        </w:rPr>
+      </w:pPr>
+      <w:proofErr w:type="spellStart"/>
+      <w:r>
+        <w:rPr>
+          <w:rFonts w:ascii="Arial" w:hAnsi="Arial" w:cs="Arial"/>
+        </w:rPr>
+        <w:t>user_id</w:t>
+      </w:r>
+      <w:proofErr w:type="spellEnd"/>
+      <w:r>
+        <w:rPr>
+          <w:rFonts w:ascii="Arial" w:hAnsi="Arial" w:cs="Arial"/>
+        </w:rPr>
+        <w:t xml:space="preserve"> – INT, idegen kulcs (kapcsolat a users.id-re)</w:t>
+      </w:r>
+    </w:p>
+    <w:p>
+      <w:pPr>
+        <w:pStyle w:val="Listaszerbekezds"/>
+        <w:numPr>
+          <w:ilvl w:val="0"/>
+          <w:numId w:val="2"/>
+        </w:numPr>
+        <w:rPr>
+          <w:rFonts w:ascii="Arial" w:hAnsi="Arial" w:cs="Arial"/>
+        </w:rPr>
+      </w:pPr>
+      <w:proofErr w:type="spellStart"/>
+      <w:r>
+        <w:rPr>
+          <w:rFonts w:ascii="Arial" w:hAnsi="Arial" w:cs="Arial"/>
+        </w:rPr>
+        <w:t>event_id</w:t>
+      </w:r>
+      <w:proofErr w:type="spellEnd"/>
+      <w:r>
+        <w:rPr>
+          <w:rFonts w:ascii="Arial" w:hAnsi="Arial" w:cs="Arial"/>
+        </w:rPr>
+        <w:t xml:space="preserve"> – INT, idegen kulcs (kapcsolat az events.id-re)</w:t>
+      </w:r>
+    </w:p>
+    <w:p>
+      <w:pPr>
+        <w:pStyle w:val="Listaszerbekezds"/>
+        <w:numPr>
+          <w:ilvl w:val="0"/>
+          <w:numId w:val="2"/>
+        </w:numPr>
+        <w:rPr>
+          <w:rFonts w:ascii="Arial" w:hAnsi="Arial" w:cs="Arial"/>
+        </w:rPr>
+      </w:pPr>
+      <w:proofErr w:type="spellStart"/>
+      <w:r>
+        <w:rPr>
+          <w:rFonts w:ascii="Arial" w:hAnsi="Arial" w:cs="Arial"/>
+        </w:rPr>
+        <w:t>registered_at</w:t>
+      </w:r>
+      <w:proofErr w:type="spellEnd"/>
+      <w:r>
+        <w:rPr>
+          <w:rFonts w:ascii="Arial" w:hAnsi="Arial" w:cs="Arial"/>
+        </w:rPr>
+        <w:t xml:space="preserve"> – TIMESTAMP, alapértelmezett CURRENT_TIMESTAMP</w:t>
+      </w:r>
+    </w:p>
+    <w:p>
+      <w:pPr>
+        <w:pStyle w:val="Listaszerbekezds"/>
+        <w:rPr>
+          <w:rFonts w:ascii="Arial" w:hAnsi="Arial" w:cs="Arial"/>
+          <w:b/>
+          <w:bCs/>
+        </w:rPr>
+      </w:pPr>
+    </w:p>
+    <w:p>
+      <w:pPr>
+        <w:rPr>
+          <w:rFonts w:ascii="Arial" w:hAnsi="Arial" w:cs="Arial"/>
+          <w:b/>
+          <w:bCs/>
+        </w:rPr>
+      </w:pPr>
+      <w:r>
+        <w:rPr>
+          <w:rFonts w:ascii="Arial" w:hAnsi="Arial" w:cs="Arial"/>
+          <w:b/>
+          <w:bCs/>
+        </w:rPr>
+        <w:t>Kapcsolatok (idegen kulcsok)</w:t>
+      </w:r>
+    </w:p>
+    <w:p>
+      <w:pPr>
+        <w:pStyle w:val="Listaszerbekezds"/>
+        <w:numPr>
+          <w:ilvl w:val="0"/>
+          <w:numId w:val="2"/>
+        </w:numPr>
+        <w:rPr>
+          <w:rFonts w:ascii="Arial" w:hAnsi="Arial" w:cs="Arial"/>
+          <w:b/>
+          <w:bCs/>
+        </w:rPr>
+      </w:pPr>
+      <w:proofErr w:type="spellStart"/>
+      <w:r>
+        <w:rPr>
+          <w:rFonts w:ascii="Arial" w:hAnsi="Arial" w:cs="Arial"/>
+          <w:b/>
+          <w:bCs/>
+        </w:rPr>
+        <w:t>events.user_id</w:t>
+      </w:r>
+      <w:proofErr w:type="spellEnd"/>
+      <w:r>
+        <w:rPr>
+          <w:rFonts w:ascii="Arial" w:hAnsi="Arial" w:cs="Arial"/>
+          <w:b/>
+          <w:bCs/>
+        </w:rPr>
+        <w:t xml:space="preserve"> → users.id</w:t>
+      </w:r>
+    </w:p>
+    <w:p>
+      <w:pPr>
+        <w:pStyle w:val="Listaszerbekezds"/>
+        <w:numPr>
+          <w:ilvl w:val="0"/>
+          <w:numId w:val="2"/>
+        </w:numPr>
+        <w:rPr>
+          <w:rFonts w:ascii="Arial" w:hAnsi="Arial" w:cs="Arial"/>
+          <w:b/>
+          <w:bCs/>
+        </w:rPr>
+      </w:pPr>
+      <w:proofErr w:type="spellStart"/>
+      <w:proofErr w:type="gramStart"/>
+      <w:r>
+        <w:rPr>
+          <w:rFonts w:ascii="Arial" w:hAnsi="Arial" w:cs="Arial"/>
+          <w:b/>
+          <w:bCs/>
+        </w:rPr>
+        <w:t>events.category</w:t>
+      </w:r>
+      <w:proofErr w:type="gramEnd"/>
+      <w:r>
+        <w:rPr>
+          <w:rFonts w:ascii="Arial" w:hAnsi="Arial" w:cs="Arial"/>
+          <w:b/>
+          <w:bCs/>
+        </w:rPr>
+        <w:t>_id</w:t>
+      </w:r>
+      <w:proofErr w:type="spellEnd"/>
+      <w:r>
+        <w:rPr>
+          <w:rFonts w:ascii="Arial" w:hAnsi="Arial" w:cs="Arial"/>
+          <w:b/>
+          <w:bCs/>
+        </w:rPr>
+        <w:t xml:space="preserve"> → categories.id</w:t>
+      </w:r>
+    </w:p>
+    <w:p>
+      <w:pPr>
+        <w:pStyle w:val="Listaszerbekezds"/>
+        <w:numPr>
+          <w:ilvl w:val="0"/>
+          <w:numId w:val="2"/>
+        </w:numPr>
+        <w:rPr>
+          <w:rFonts w:ascii="Arial" w:hAnsi="Arial" w:cs="Arial"/>
+          <w:b/>
+          <w:bCs/>
+        </w:rPr>
+      </w:pPr>
+      <w:proofErr w:type="spellStart"/>
+      <w:r>
+        <w:rPr>
+          <w:rFonts w:ascii="Arial" w:hAnsi="Arial" w:cs="Arial"/>
+          <w:b/>
+          <w:bCs/>
+        </w:rPr>
+        <w:t>registrations.user_id</w:t>
+      </w:r>
+      <w:proofErr w:type="spellEnd"/>
+      <w:r>
+        <w:rPr>
+          <w:rFonts w:ascii="Arial" w:hAnsi="Arial" w:cs="Arial"/>
+          <w:b/>
+          <w:bCs/>
+        </w:rPr>
+        <w:t xml:space="preserve"> → users.id</w:t>
+      </w:r>
+    </w:p>
+    <w:p>
+      <w:pPr>
+        <w:pStyle w:val="Listaszerbekezds"/>
+        <w:numPr>
+          <w:ilvl w:val="0"/>
+          <w:numId w:val="2"/>
+        </w:numPr>
+        <w:rPr>
+          <w:rFonts w:ascii="Arial" w:hAnsi="Arial" w:cs="Arial"/>
+          <w:b/>
+          <w:bCs/>
+        </w:rPr>
+      </w:pPr>
+      <w:proofErr w:type="spellStart"/>
+      <w:proofErr w:type="gramStart"/>
+      <w:r>
+        <w:rPr>
+          <w:rFonts w:ascii="Arial" w:hAnsi="Arial" w:cs="Arial"/>
+          <w:b/>
+          <w:bCs/>
+        </w:rPr>
+        <w:t>registrations.event</w:t>
+      </w:r>
+      <w:proofErr w:type="gramEnd"/>
+      <w:r>
+        <w:rPr>
+          <w:rFonts w:ascii="Arial" w:hAnsi="Arial" w:cs="Arial"/>
+          <w:b/>
+          <w:bCs/>
+        </w:rPr>
+        <w:t>_id</w:t>
+      </w:r>
+      <w:proofErr w:type="spellEnd"/>
+      <w:r>
+        <w:rPr>
+          <w:rFonts w:ascii="Arial" w:hAnsi="Arial" w:cs="Arial"/>
+          <w:b/>
+          <w:bCs/>
+        </w:rPr>
+        <w:t xml:space="preserve"> → events.id</w:t>
+      </w:r>
+    </w:p>
+    <w:p>
+      <w:pPr>
+        <w:rPr>
+          <w:rFonts w:ascii="Arial" w:hAnsi="Arial" w:cs="Arial"/>
+        </w:rPr>
+      </w:pPr>
+      <w:r>
+        <w:rPr>
+          <w:rFonts w:ascii="Arial" w:hAnsi="Arial" w:cs="Arial"/>
+        </w:rPr>
+        <w:t>Egy felhasználó (</w:t>
+      </w:r>
+      <w:proofErr w:type="spellStart"/>
+      <w:r>
+        <w:rPr>
+          <w:rFonts w:ascii="Arial" w:hAnsi="Arial" w:cs="Arial"/>
+        </w:rPr>
+        <w:t>users</w:t>
+      </w:r>
+      <w:proofErr w:type="spellEnd"/>
+      <w:r>
+        <w:rPr>
+          <w:rFonts w:ascii="Arial" w:hAnsi="Arial" w:cs="Arial"/>
+        </w:rPr>
+        <w:t>) több eseményt (</w:t>
+      </w:r>
+      <w:proofErr w:type="spellStart"/>
+      <w:r>
+        <w:rPr>
+          <w:rFonts w:ascii="Arial" w:hAnsi="Arial" w:cs="Arial"/>
+        </w:rPr>
+        <w:t>events</w:t>
+      </w:r>
+      <w:proofErr w:type="spellEnd"/>
+      <w:r>
+        <w:rPr>
+          <w:rFonts w:ascii="Arial" w:hAnsi="Arial" w:cs="Arial"/>
+        </w:rPr>
+        <w:t>) is létrehozhat.</w:t>
+      </w:r>
+    </w:p>
+    <w:p>
+      <w:pPr>
+        <w:rPr>
+          <w:rFonts w:ascii="Arial" w:hAnsi="Arial" w:cs="Arial"/>
+        </w:rPr>
+      </w:pPr>
+      <w:r>
+        <w:rPr>
+          <w:rFonts w:ascii="Arial" w:hAnsi="Arial" w:cs="Arial"/>
+        </w:rPr>
+        <w:t>Egy esemény egyetlen kategóriába (</w:t>
+      </w:r>
+      <w:proofErr w:type="spellStart"/>
+      <w:r>
+        <w:rPr>
+          <w:rFonts w:ascii="Arial" w:hAnsi="Arial" w:cs="Arial"/>
+        </w:rPr>
+        <w:t>categories</w:t>
+      </w:r>
+      <w:proofErr w:type="spellEnd"/>
+      <w:r>
+        <w:rPr>
+          <w:rFonts w:ascii="Arial" w:hAnsi="Arial" w:cs="Arial"/>
+        </w:rPr>
+        <w:t>) tartozik.</w:t>
+      </w:r>
+    </w:p>
+    <w:p>
+      <w:pPr>
+        <w:rPr>
+          <w:rFonts w:ascii="Arial" w:hAnsi="Arial" w:cs="Arial"/>
+        </w:rPr>
+      </w:pPr>
+      <w:r>
+        <w:rPr>
+          <w:rFonts w:ascii="Arial" w:hAnsi="Arial" w:cs="Arial"/>
+        </w:rPr>
+        <w:t>Egy felhasználó több eseményre is regisztrálhat (</w:t>
+      </w:r>
+      <w:proofErr w:type="spellStart"/>
+      <w:r>
+        <w:rPr>
+          <w:rFonts w:ascii="Arial" w:hAnsi="Arial" w:cs="Arial"/>
+        </w:rPr>
+        <w:t>registrations</w:t>
+      </w:r>
+      <w:proofErr w:type="spellEnd"/>
+      <w:r>
+        <w:rPr>
+          <w:rFonts w:ascii="Arial" w:hAnsi="Arial" w:cs="Arial"/>
+        </w:rPr>
+        <w:t>).</w:t>
+      </w:r>
+    </w:p>
+    <w:p>
+      <w:pPr>
+        <w:rPr>
+          <w:rFonts w:ascii="Arial" w:hAnsi="Arial" w:cs="Arial"/>
+        </w:rPr>
+      </w:pPr>
+      <w:r>
+        <w:rPr>
+          <w:rFonts w:ascii="Arial" w:hAnsi="Arial" w:cs="Arial"/>
+        </w:rPr>
+        <w:t>Egy eseményre több felhasználó is regisztrálhat.</w:t>
+      </w:r>
     </w:p>
     <w:p>
       <w:pPr>
@@ -25699,6 +26520,7 @@
         <w:rPr>
           <w:rFonts w:ascii="Arial" w:hAnsi="Arial" w:cs="Arial"/>
         </w:rPr>
+        <w:lastRenderedPageBreak/>
         <w:t xml:space="preserve">Az </w:t>
       </w:r>
       <w:proofErr w:type="spellStart"/>
@@ -25786,12 +26608,56 @@
         <w:rPr>
           <w:rFonts w:ascii="Arial" w:hAnsi="Arial" w:cs="Arial"/>
         </w:rPr>
-        <w:t>Számos ötletünk van, amivel szeretnénk a jövőben kibővíteni a projektet. Ilyen például a cégként való regisztrálás és a szerepkörhöz tartozó funkciók megvalósítása (szabad időpontok meghirdetése rendezvényekhez, hivatalos események közzététele). Mindenkit érintő fejlesztés lenne, hogy nem csak eseményeket, hanem felhasználókat (magánszemélyeket és cégeket) is lehessen értékelni.</w:t>
+        <w:t>Számos ötletünk van, amivel szeretnénk a jövőben kibővíteni a projektet. Ilyen például a cégként való regisztrálás és a szerepkörhöz tartozó funkciók megvalósítása (szabad időpontok meghirdetése rendezvényekhez, hivatalos események közzététele).</w:t>
       </w:r>
     </w:p>
     <w:p>
       <w:pPr>
         <w:pStyle w:val="Listaszerbekezds"/>
+        <w:jc w:val="both"/>
+        <w:rPr>
+          <w:rFonts w:ascii="Arial" w:hAnsi="Arial" w:cs="Arial"/>
+        </w:rPr>
+      </w:pPr>
+      <w:r>
+        <w:rPr>
+          <w:rFonts w:ascii="Arial" w:hAnsi="Arial" w:cs="Arial"/>
+        </w:rPr>
+        <w:t xml:space="preserve">Másik </w:t>
+      </w:r>
+      <w:proofErr w:type="gramStart"/>
+      <w:r>
+        <w:rPr>
+          <w:rFonts w:ascii="Arial" w:hAnsi="Arial" w:cs="Arial"/>
+        </w:rPr>
+        <w:t>fejlesztés</w:t>
+      </w:r>
+      <w:proofErr w:type="gramEnd"/>
+      <w:r>
+        <w:rPr>
+          <w:rFonts w:ascii="Arial" w:hAnsi="Arial" w:cs="Arial"/>
+        </w:rPr>
+        <w:t xml:space="preserve"> amivel kibővítenénk az a statisztika oldal, itt az </w:t>
+      </w:r>
+      <w:proofErr w:type="spellStart"/>
+      <w:r>
+        <w:rPr>
+          <w:rFonts w:ascii="Arial" w:hAnsi="Arial" w:cs="Arial"/>
+        </w:rPr>
+        <w:t>admin</w:t>
+      </w:r>
+      <w:proofErr w:type="spellEnd"/>
+      <w:r>
+        <w:rPr>
+          <w:rFonts w:ascii="Arial" w:hAnsi="Arial" w:cs="Arial"/>
+        </w:rPr>
+        <w:t xml:space="preserve"> felhasználó láthatná hónapokra lebontva hány eseményt hoztak létre, melyek voltak ezek közül a legnépszerűbbek, milyen kategóriában hozták létre a legtöbb eseményt.</w:t>
+      </w:r>
+    </w:p>
+    <w:p>
+      <w:pPr>
+        <w:pStyle w:val="Listaszerbekezds"/>
+        <w:jc w:val="both"/>
         <w:rPr>
           <w:rFonts w:ascii="Arial" w:hAnsi="Arial" w:cs="Arial"/>
           <w:b/>
@@ -26363,6 +27229,129 @@
         </w:rPr>
         <w:t>”, nyomjon egy entert és készen is van.</w:t>
       </w:r>
+    </w:p>
+    <w:p>
+      <w:pPr>
+        <w:ind w:left="708"/>
+        <w:jc w:val="both"/>
+        <w:rPr>
+          <w:rFonts w:ascii="Arial" w:hAnsi="Arial" w:cs="Arial"/>
+        </w:rPr>
+      </w:pPr>
+      <w:r>
+        <w:rPr>
+          <w:rFonts w:ascii="Arial" w:hAnsi="Arial" w:cs="Arial"/>
+        </w:rPr>
+        <w:t xml:space="preserve">A </w:t>
+      </w:r>
+      <w:proofErr w:type="spellStart"/>
+      <w:r>
+        <w:rPr>
+          <w:rFonts w:ascii="Arial" w:hAnsi="Arial" w:cs="Arial"/>
+          <w:b/>
+          <w:bCs/>
+        </w:rPr>
+        <w:t>J</w:t>
+      </w:r>
+      <w:r>
+        <w:rPr>
+          <w:rFonts w:ascii="Arial" w:hAnsi="Arial" w:cs="Arial"/>
+          <w:b/>
+          <w:bCs/>
+        </w:rPr>
+        <w:t>ira</w:t>
+      </w:r>
+      <w:proofErr w:type="spellEnd"/>
+      <w:r>
+        <w:rPr>
+          <w:rFonts w:ascii="Arial" w:hAnsi="Arial" w:cs="Arial"/>
+        </w:rPr>
+        <w:t xml:space="preserve"> oldalt </w:t>
+      </w:r>
+      <w:hyperlink r:id="rId8" w:history="1">
+        <w:r>
+          <w:rPr>
+            <w:rStyle w:val="Hiperhivatkozs"/>
+            <w:rFonts w:ascii="Arial" w:hAnsi="Arial" w:cs="Arial"/>
+          </w:rPr>
+          <w:t>itt</w:t>
+        </w:r>
+      </w:hyperlink>
+      <w:r>
+        <w:rPr>
+          <w:rFonts w:ascii="Arial" w:hAnsi="Arial" w:cs="Arial"/>
+        </w:rPr>
+        <w:t xml:space="preserve"> érheti el.</w:t>
+      </w:r>
+    </w:p>
+    <w:p>
+      <w:pPr>
+        <w:ind w:left="708"/>
+        <w:jc w:val="both"/>
+        <w:rPr>
+          <w:rFonts w:ascii="Arial" w:hAnsi="Arial" w:cs="Arial"/>
+        </w:rPr>
+      </w:pPr>
+      <w:r>
+        <w:rPr>
+          <w:rFonts w:ascii="Arial" w:hAnsi="Arial" w:cs="Arial"/>
+        </w:rPr>
+        <w:t xml:space="preserve">A </w:t>
+      </w:r>
+      <w:r>
+        <w:rPr>
+          <w:rFonts w:ascii="Arial" w:hAnsi="Arial" w:cs="Arial"/>
+          <w:b/>
+          <w:bCs/>
+        </w:rPr>
+        <w:t>GitHub</w:t>
+      </w:r>
+      <w:r>
+        <w:rPr>
+          <w:rFonts w:ascii="Arial" w:hAnsi="Arial" w:cs="Arial"/>
+        </w:rPr>
+        <w:t xml:space="preserve"> </w:t>
+      </w:r>
+      <w:proofErr w:type="spellStart"/>
+      <w:r>
+        <w:rPr>
+          <w:rFonts w:ascii="Arial" w:hAnsi="Arial" w:cs="Arial"/>
+          <w:b/>
+          <w:bCs/>
+        </w:rPr>
+        <w:t>repositoryt</w:t>
+      </w:r>
+      <w:proofErr w:type="spellEnd"/>
+      <w:r>
+        <w:rPr>
+          <w:rFonts w:ascii="Arial" w:hAnsi="Arial" w:cs="Arial"/>
+        </w:rPr>
+        <w:t xml:space="preserve"> pedig </w:t>
+      </w:r>
+      <w:hyperlink r:id="rId9" w:history="1">
+        <w:r>
+          <w:rPr>
+            <w:rStyle w:val="Hiperhivatkozs"/>
+            <w:rFonts w:ascii="Arial" w:hAnsi="Arial" w:cs="Arial"/>
+          </w:rPr>
+          <w:t>itt</w:t>
+        </w:r>
+      </w:hyperlink>
+      <w:r>
+        <w:rPr>
+          <w:rFonts w:ascii="Arial" w:hAnsi="Arial" w:cs="Arial"/>
+        </w:rPr>
+        <w:t xml:space="preserve"> érheti el.</w:t>
+      </w:r>
+    </w:p>
+    <w:p>
+      <w:pPr>
+        <w:ind w:left="720"/>
+        <w:jc w:val="both"/>
+        <w:rPr>
+          <w:rFonts w:ascii="Arial" w:hAnsi="Arial" w:cs="Arial"/>
+        </w:rPr>
+      </w:pPr>
     </w:p>
     <w:sectPr>
       <w:pgSz w:w="11906" w:h="16838"/>
@@ -27190,6 +28179,7 @@
   <w:style w:type="character" w:default="1" w:styleId="Bekezdsalapbettpusa">
     <w:name w:val="Default Paragraph Font"/>
     <w:uiPriority w:val="1"/>
+    <w:semiHidden/>
     <w:unhideWhenUsed/>
   </w:style>
   <w:style w:type="table" w:default="1" w:styleId="Normltblzat">

</xml_diff>